<commit_message>
fix: corrige função de geração de docx saindo desformatado
</commit_message>
<xml_diff>
--- a/app/templates/docx/proposta_tecnica_comercial.docx
+++ b/app/templates/docx/proposta_tecnica_comercial.docx
@@ -370,7 +370,7 @@
                                 <w:color w:val="FFFFFF"/>
                                 <w:sz w:val="30"/>
                               </w:rPr>
-                              <w:t xml:space="preserve"> - Rev. 00</w:t>
+                              <w:t xml:space="preserve"> - Rev. {{REVISAO_ATUAL}}</w:t>
                             </w:r>
                           </w:p>
                         </w:txbxContent>
@@ -420,7 +420,7 @@
                           <w:color w:val="FFFFFF"/>
                           <w:sz w:val="30"/>
                         </w:rPr>
-                        <w:t xml:space="preserve"> - Rev. 00</w:t>
+                        <w:t xml:space="preserve"> - Rev. {{REVISAO_ATUAL}}</w:t>
                       </w:r>
                     </w:p>
                   </w:txbxContent>

</xml_diff>

<commit_message>
fix: corrige funções de atualização e conversação também com separação de propostas
</commit_message>
<xml_diff>
--- a/app/templates/docx/proposta_tecnica_comercial.docx
+++ b/app/templates/docx/proposta_tecnica_comercial.docx
@@ -188,7 +188,7 @@
                                 <w:color w:val="FFFFFF"/>
                                 <w:sz w:val="72"/>
                               </w:rPr>
-                              <w:t>TÉCNICA E</w:t>
+                              <w:t>{{TITULO_LINHA2}}</w:t>
                             </w:r>
                           </w:p>
                           <w:p>
@@ -206,7 +206,7 @@
                                 <w:color w:val="FFFFFF"/>
                                 <w:sz w:val="72"/>
                               </w:rPr>
-                              <w:t>COMERCIAL</w:t>
+                              <w:t>{{TITULO_LINHA3}}</w:t>
                             </w:r>
                           </w:p>
                         </w:txbxContent>
@@ -264,7 +264,7 @@
                           <w:color w:val="FFFFFF"/>
                           <w:sz w:val="72"/>
                         </w:rPr>
-                        <w:t>TÉCNICA E</w:t>
+                        <w:t>{{TITULO_LINHA2}}</w:t>
                       </w:r>
                     </w:p>
                     <w:p>
@@ -282,7 +282,7 @@
                           <w:color w:val="FFFFFF"/>
                           <w:sz w:val="72"/>
                         </w:rPr>
-                        <w:t>COMERCIAL</w:t>
+                        <w:t>{{TITULO_LINHA3}}</w:t>
                       </w:r>
                     </w:p>
                   </w:txbxContent>

</xml_diff>

<commit_message>
feat: adiciona processamento do kmz via job e inclusão da imagem da área na proposta
</commit_message>
<xml_diff>
--- a/app/templates/docx/proposta_tecnica_comercial.docx
+++ b/app/templates/docx/proposta_tecnica_comercial.docx
@@ -2789,6 +2789,12 @@
           <w:rFonts w:ascii="Metropolis" w:eastAsia="Metropolis" w:hAnsi="Metropolis" w:cs="Metropolis"/>
         </w:rPr>
       </w:pPr>
+      <w:r>
+        <w:rPr>
+          <w:rFonts w:ascii="Metropolis" w:eastAsia="Metropolis" w:hAnsi="Metropolis" w:cs="Metropolis"/>
+        </w:rPr>
+        <w:t xml:space="preserve">{{MAPA_AREA_ESTUDO}}</w:t>
+      </w:r>
     </w:p>
     <w:p>
       <w:pPr>

</xml_diff>

<commit_message>
feat: adiciona quadros completos de propostas
</commit_message>
<xml_diff>
--- a/app/templates/docx/proposta_tecnica_comercial.docx
+++ b/app/templates/docx/proposta_tecnica_comercial.docx
@@ -2519,7 +2519,7 @@
           <w:rFonts w:ascii="Metropolis" w:eastAsia="Metropolis" w:hAnsi="Metropolis" w:cs="Metropolis"/>
           <w:color w:val="000000"/>
         </w:rPr>
-        <w:t>(11) 96404-6683</w:t>
+        <w:t>(71) 99320-0222</w:t>
       </w:r>
     </w:p>
     <w:p>
@@ -2974,8 +2974,7 @@
         <w:tblLook w:val="0400" w:firstRow="0" w:lastRow="0" w:firstColumn="0" w:lastColumn="0" w:noHBand="0" w:noVBand="1"/>
       </w:tblPr>
       <w:tblGrid>
-        <w:gridCol w:w="6325"/>
-        <w:gridCol w:w="990"/>
+        <w:gridCol w:w="7315"/>
         <w:gridCol w:w="1179"/>
       </w:tblGrid>
       <w:tr>
@@ -2985,7 +2984,7 @@
         </w:trPr>
         <w:tc>
           <w:tcPr>
-            <w:tcW w:w="6325" w:type="dxa"/>
+            <w:tcW w:w="7315" w:type="dxa"/>
             <w:vAlign w:val="center"/>
           </w:tcPr>
           <w:p>
@@ -3014,41 +3013,6 @@
                 <w:szCs w:val="20"/>
               </w:rPr>
               <w:t>PRODUTOS</w:t>
-            </w:r>
-          </w:p>
-        </w:tc>
-        <w:tc>
-          <w:tcPr>
-            <w:tcW w:w="990" w:type="dxa"/>
-            <w:vAlign w:val="center"/>
-          </w:tcPr>
-          <w:p>
-            <w:pPr>
-              <w:spacing w:after="0" w:line="240" w:lineRule="auto"/>
-              <w:jc w:val="center"/>
-              <w:rPr>
-                <w:rFonts w:ascii="Metropolis" w:eastAsia="Metropolis" w:hAnsi="Metropolis" w:cs="Metropolis"/>
-                <w:b/>
-                <w:sz w:val="20"/>
-                <w:szCs w:val="20"/>
-              </w:rPr>
-            </w:pPr>
-            <w:r>
-              <w:rPr>
-                <w:rFonts w:ascii="Metropolis" w:eastAsia="Metropolis" w:hAnsi="Metropolis" w:cs="Metropolis"/>
-                <w:b/>
-                <w:sz w:val="20"/>
-                <w:szCs w:val="20"/>
-              </w:rPr>
-              <w:t>QUANT.</w:t>
-            </w:r>
-            <w:r>
-              <w:rPr>
-                <w:b/>
-                <w:sz w:val="20"/>
-                <w:szCs w:val="20"/>
-              </w:rPr>
-              <w:t> </w:t>
             </w:r>
           </w:p>
         </w:tc>
@@ -3085,29 +3049,12 @@
         </w:trPr>
         <w:tc>
           <w:tcPr>
-            <w:tcW w:w="6325" w:type="dxa"/>
+            <w:tcW w:w="7315" w:type="dxa"/>
             <w:vAlign w:val="center"/>
           </w:tcPr>
           <w:p>
             <w:pPr>
               <w:spacing w:after="0" w:line="240" w:lineRule="auto"/>
-              <w:rPr>
-                <w:rFonts w:ascii="Metropolis" w:eastAsia="Metropolis" w:hAnsi="Metropolis" w:cs="Metropolis"/>
-                <w:sz w:val="20"/>
-                <w:szCs w:val="20"/>
-              </w:rPr>
-            </w:pPr>
-          </w:p>
-        </w:tc>
-        <w:tc>
-          <w:tcPr>
-            <w:tcW w:w="990" w:type="dxa"/>
-            <w:vAlign w:val="center"/>
-          </w:tcPr>
-          <w:p>
-            <w:pPr>
-              <w:spacing w:after="0" w:line="240" w:lineRule="auto"/>
-              <w:jc w:val="center"/>
               <w:rPr>
                 <w:rFonts w:ascii="Metropolis" w:eastAsia="Metropolis" w:hAnsi="Metropolis" w:cs="Metropolis"/>
                 <w:sz w:val="20"/>
@@ -3137,29 +3084,12 @@
         </w:trPr>
         <w:tc>
           <w:tcPr>
-            <w:tcW w:w="6325" w:type="dxa"/>
+            <w:tcW w:w="7315" w:type="dxa"/>
             <w:vAlign w:val="center"/>
           </w:tcPr>
           <w:p>
             <w:pPr>
               <w:spacing w:after="0" w:line="240" w:lineRule="auto"/>
-              <w:rPr>
-                <w:rFonts w:ascii="Metropolis" w:eastAsia="Metropolis" w:hAnsi="Metropolis" w:cs="Metropolis"/>
-                <w:sz w:val="20"/>
-                <w:szCs w:val="20"/>
-              </w:rPr>
-            </w:pPr>
-          </w:p>
-        </w:tc>
-        <w:tc>
-          <w:tcPr>
-            <w:tcW w:w="990" w:type="dxa"/>
-            <w:vAlign w:val="center"/>
-          </w:tcPr>
-          <w:p>
-            <w:pPr>
-              <w:spacing w:after="0" w:line="240" w:lineRule="auto"/>
-              <w:jc w:val="center"/>
               <w:rPr>
                 <w:rFonts w:ascii="Metropolis" w:eastAsia="Metropolis" w:hAnsi="Metropolis" w:cs="Metropolis"/>
                 <w:sz w:val="20"/>
@@ -3189,29 +3119,12 @@
         </w:trPr>
         <w:tc>
           <w:tcPr>
-            <w:tcW w:w="6325" w:type="dxa"/>
+            <w:tcW w:w="7315" w:type="dxa"/>
             <w:vAlign w:val="center"/>
           </w:tcPr>
           <w:p>
             <w:pPr>
               <w:spacing w:after="0" w:line="240" w:lineRule="auto"/>
-              <w:rPr>
-                <w:rFonts w:ascii="Metropolis" w:eastAsia="Metropolis" w:hAnsi="Metropolis" w:cs="Metropolis"/>
-                <w:sz w:val="20"/>
-                <w:szCs w:val="20"/>
-              </w:rPr>
-            </w:pPr>
-          </w:p>
-        </w:tc>
-        <w:tc>
-          <w:tcPr>
-            <w:tcW w:w="990" w:type="dxa"/>
-            <w:vAlign w:val="center"/>
-          </w:tcPr>
-          <w:p>
-            <w:pPr>
-              <w:spacing w:after="0" w:line="240" w:lineRule="auto"/>
-              <w:jc w:val="center"/>
               <w:rPr>
                 <w:rFonts w:ascii="Metropolis" w:eastAsia="Metropolis" w:hAnsi="Metropolis" w:cs="Metropolis"/>
                 <w:sz w:val="20"/>
@@ -3241,29 +3154,12 @@
         </w:trPr>
         <w:tc>
           <w:tcPr>
-            <w:tcW w:w="6325" w:type="dxa"/>
+            <w:tcW w:w="7315" w:type="dxa"/>
             <w:vAlign w:val="center"/>
           </w:tcPr>
           <w:p>
             <w:pPr>
               <w:spacing w:after="0" w:line="240" w:lineRule="auto"/>
-              <w:rPr>
-                <w:rFonts w:ascii="Metropolis" w:eastAsia="Metropolis" w:hAnsi="Metropolis" w:cs="Metropolis"/>
-                <w:sz w:val="20"/>
-                <w:szCs w:val="20"/>
-              </w:rPr>
-            </w:pPr>
-          </w:p>
-        </w:tc>
-        <w:tc>
-          <w:tcPr>
-            <w:tcW w:w="990" w:type="dxa"/>
-            <w:vAlign w:val="center"/>
-          </w:tcPr>
-          <w:p>
-            <w:pPr>
-              <w:spacing w:after="0" w:line="240" w:lineRule="auto"/>
-              <w:jc w:val="center"/>
               <w:rPr>
                 <w:rFonts w:ascii="Metropolis" w:eastAsia="Metropolis" w:hAnsi="Metropolis" w:cs="Metropolis"/>
                 <w:sz w:val="20"/>
@@ -3293,29 +3189,12 @@
         </w:trPr>
         <w:tc>
           <w:tcPr>
-            <w:tcW w:w="6325" w:type="dxa"/>
+            <w:tcW w:w="7315" w:type="dxa"/>
             <w:vAlign w:val="center"/>
           </w:tcPr>
           <w:p>
             <w:pPr>
               <w:spacing w:after="0" w:line="240" w:lineRule="auto"/>
-              <w:rPr>
-                <w:rFonts w:ascii="Metropolis" w:eastAsia="Metropolis" w:hAnsi="Metropolis" w:cs="Metropolis"/>
-                <w:sz w:val="20"/>
-                <w:szCs w:val="20"/>
-              </w:rPr>
-            </w:pPr>
-          </w:p>
-        </w:tc>
-        <w:tc>
-          <w:tcPr>
-            <w:tcW w:w="990" w:type="dxa"/>
-            <w:vAlign w:val="center"/>
-          </w:tcPr>
-          <w:p>
-            <w:pPr>
-              <w:spacing w:after="0" w:line="240" w:lineRule="auto"/>
-              <w:jc w:val="center"/>
               <w:rPr>
                 <w:rFonts w:ascii="Metropolis" w:eastAsia="Metropolis" w:hAnsi="Metropolis" w:cs="Metropolis"/>
                 <w:sz w:val="20"/>
@@ -3345,29 +3224,12 @@
         </w:trPr>
         <w:tc>
           <w:tcPr>
-            <w:tcW w:w="6325" w:type="dxa"/>
+            <w:tcW w:w="7315" w:type="dxa"/>
             <w:vAlign w:val="center"/>
           </w:tcPr>
           <w:p>
             <w:pPr>
               <w:spacing w:after="0" w:line="240" w:lineRule="auto"/>
-              <w:rPr>
-                <w:rFonts w:ascii="Metropolis" w:eastAsia="Metropolis" w:hAnsi="Metropolis" w:cs="Metropolis"/>
-                <w:sz w:val="20"/>
-                <w:szCs w:val="20"/>
-              </w:rPr>
-            </w:pPr>
-          </w:p>
-        </w:tc>
-        <w:tc>
-          <w:tcPr>
-            <w:tcW w:w="990" w:type="dxa"/>
-            <w:vAlign w:val="center"/>
-          </w:tcPr>
-          <w:p>
-            <w:pPr>
-              <w:spacing w:after="0" w:line="240" w:lineRule="auto"/>
-              <w:jc w:val="center"/>
               <w:rPr>
                 <w:rFonts w:ascii="Metropolis" w:eastAsia="Metropolis" w:hAnsi="Metropolis" w:cs="Metropolis"/>
                 <w:sz w:val="20"/>
@@ -3397,29 +3259,12 @@
         </w:trPr>
         <w:tc>
           <w:tcPr>
-            <w:tcW w:w="6325" w:type="dxa"/>
+            <w:tcW w:w="7315" w:type="dxa"/>
             <w:vAlign w:val="center"/>
           </w:tcPr>
           <w:p>
             <w:pPr>
               <w:spacing w:after="0" w:line="240" w:lineRule="auto"/>
-              <w:rPr>
-                <w:rFonts w:ascii="Metropolis" w:eastAsia="Metropolis" w:hAnsi="Metropolis" w:cs="Metropolis"/>
-                <w:sz w:val="20"/>
-                <w:szCs w:val="20"/>
-              </w:rPr>
-            </w:pPr>
-          </w:p>
-        </w:tc>
-        <w:tc>
-          <w:tcPr>
-            <w:tcW w:w="990" w:type="dxa"/>
-            <w:vAlign w:val="center"/>
-          </w:tcPr>
-          <w:p>
-            <w:pPr>
-              <w:spacing w:after="0" w:line="240" w:lineRule="auto"/>
-              <w:jc w:val="center"/>
               <w:rPr>
                 <w:rFonts w:ascii="Metropolis" w:eastAsia="Metropolis" w:hAnsi="Metropolis" w:cs="Metropolis"/>
                 <w:sz w:val="20"/>
@@ -4115,72 +3960,6 @@
           <w:rFonts w:ascii="Metropolis" w:eastAsia="Metropolis" w:hAnsi="Metropolis" w:cs="Metropolis"/>
         </w:rPr>
         <w:t xml:space="preserve"> informações e esclarecimentos que eventualmente venham a ser solicitados, e que digam respeito à natureza dos serviços contratados.</w:t>
-      </w:r>
-    </w:p>
-    <w:p>
-      <w:pPr>
-        <w:numPr>
-          <w:ilvl w:val="0"/>
-          <w:numId w:val="3"/>
-        </w:numPr>
-        <w:spacing w:after="0" w:line="360" w:lineRule="auto"/>
-        <w:ind w:left="0" w:firstLine="0"/>
-        <w:jc w:val="both"/>
-        <w:rPr>
-          <w:rFonts w:ascii="Metropolis" w:eastAsia="Metropolis" w:hAnsi="Metropolis" w:cs="Metropolis"/>
-        </w:rPr>
-      </w:pPr>
-      <w:r>
-        <w:rPr>
-          <w:rFonts w:ascii="Metropolis" w:eastAsia="Metropolis" w:hAnsi="Metropolis" w:cs="Metropolis"/>
-        </w:rPr>
-        <w:t xml:space="preserve">Fornecer rádios comunicadores para todos da equipe da </w:t>
-      </w:r>
-      <w:r>
-        <w:rPr>
-          <w:rFonts w:ascii="Metropolis" w:eastAsia="Metropolis" w:hAnsi="Metropolis" w:cs="Metropolis"/>
-          <w:b/>
-        </w:rPr>
-        <w:t>PAPYRUS</w:t>
-      </w:r>
-      <w:r>
-        <w:rPr>
-          <w:rFonts w:ascii="Metropolis" w:eastAsia="Metropolis" w:hAnsi="Metropolis" w:cs="Metropolis"/>
-        </w:rPr>
-        <w:t>.</w:t>
-      </w:r>
-    </w:p>
-    <w:p>
-      <w:pPr>
-        <w:numPr>
-          <w:ilvl w:val="0"/>
-          <w:numId w:val="3"/>
-        </w:numPr>
-        <w:spacing w:after="0" w:line="360" w:lineRule="auto"/>
-        <w:ind w:left="0" w:firstLine="0"/>
-        <w:jc w:val="both"/>
-        <w:rPr>
-          <w:rFonts w:ascii="Metropolis" w:eastAsia="Metropolis" w:hAnsi="Metropolis" w:cs="Metropolis"/>
-        </w:rPr>
-      </w:pPr>
-      <w:r>
-        <w:rPr>
-          <w:rFonts w:ascii="Metropolis" w:eastAsia="Metropolis" w:hAnsi="Metropolis" w:cs="Metropolis"/>
-        </w:rPr>
-        <w:t xml:space="preserve">Disponibilizar espaço físico e mobiliado, com ar condicionado, banheiro, água potável, etc., para a equipe de </w:t>
-      </w:r>
-      <w:r>
-        <w:rPr>
-          <w:rFonts w:ascii="Metropolis" w:eastAsia="Metropolis" w:hAnsi="Metropolis" w:cs="Metropolis"/>
-          <w:b/>
-        </w:rPr>
-        <w:t>PAPYRUS</w:t>
-      </w:r>
-      <w:r>
-        <w:rPr>
-          <w:rFonts w:ascii="Metropolis" w:eastAsia="Metropolis" w:hAnsi="Metropolis" w:cs="Metropolis"/>
-        </w:rPr>
-        <w:t>, assim como espaço e equipamentos para CATFA.</w:t>
       </w:r>
     </w:p>
     <w:p>
@@ -5496,7 +5275,7 @@
           <w:rFonts w:ascii="Metropolis" w:eastAsia="Metropolis" w:hAnsi="Metropolis" w:cs="Metropolis"/>
           <w:color w:val="000000"/>
         </w:rPr>
-        <w:t>O prazo contratual será de {{PRAZO_EXECUCAO}}. O prazo será contato a partir da assinatura do contrato, da emissão da Ordem de Serviço (O.S.) emitida pela Contratante, disponibilização de todas as informações, depósito do valor da mobilização e poderá sofrer alterações, conforme alinhamentos entre contratante e contratado. Não nos responsabilizamos pelos prazos dos órgãos ambientais e intervenientes.</w:t>
+        <w:t>O prazo contratual para execução dos serviços será {{PRAZO_EXECUCAO}}, contado a partir da assinatura do contrato, emissão da Ordem de Serviço (O.S.) pela CONTRATANTE, disponibilização de todas as informações e documentos necessários, bem como do pagamento do valor referente à mobilização.</w:t>
       </w:r>
     </w:p>
     <w:p>
@@ -5515,6 +5294,13 @@
           <w:color w:val="000000"/>
         </w:rPr>
       </w:pPr>
+      <w:r>
+        <w:rPr>
+          <w:rFonts w:ascii="Metropolis" w:eastAsia="Metropolis" w:hAnsi="Metropolis" w:cs="Metropolis"/>
+          <w:color w:val="000000"/>
+        </w:rPr>
+        <w:t>O referido prazo poderá ter alterações mediante alinhamento formal entre CONTRATANTE e CONTRATADA. Ressalta-se que a CONTRATADA não se responsabiliza pelos prazos de análise, manifestação ou deliberação dos órgãos ambientais e demais órgãos intervenientes.</w:t>
+      </w:r>
     </w:p>
     <w:p>
       <w:pPr>
@@ -5535,6 +5321,23 @@
     </w:p>
     <w:p>
       <w:pPr>
+        <w:pBdr>
+          <w:top w:val="nil"/>
+          <w:left w:val="nil"/>
+          <w:bottom w:val="nil"/>
+          <w:right w:val="nil"/>
+          <w:between w:val="nil"/>
+        </w:pBdr>
+        <w:spacing w:after="0" w:line="360" w:lineRule="auto"/>
+        <w:jc w:val="both"/>
+        <w:rPr>
+          <w:rFonts w:ascii="Metropolis" w:eastAsia="Metropolis" w:hAnsi="Metropolis" w:cs="Metropolis"/>
+          <w:color w:val="000000"/>
+        </w:rPr>
+      </w:pPr>
+    </w:p>
+    <w:p>
+      <w:pPr>
         <w:pStyle w:val="Ttulo1"/>
         <w:numPr>
           <w:ilvl w:val="0"/>
@@ -5579,27 +5382,27 @@
         <w:rPr>
           <w:rFonts w:ascii="Metropolis" w:eastAsia="Metropolis" w:hAnsi="Metropolis" w:cs="Metropolis"/>
         </w:rPr>
-        <w:t xml:space="preserve">O preço proposto para a execução dos serviços está apresentado no </w:t>
+        <w:t xml:space="preserve">O preço proposto para a execução dos serviços é de </w:t>
       </w:r>
       <w:r>
         <w:rPr>
           <w:rFonts w:ascii="Metropolis" w:eastAsia="Metropolis" w:hAnsi="Metropolis" w:cs="Metropolis"/>
           <w:b/>
         </w:rPr>
-        <w:t xml:space="preserve">Quadro 10-1, </w:t>
-      </w:r>
-      <w:r>
-        <w:rPr>
-          <w:rFonts w:ascii="Metropolis" w:eastAsia="Metropolis" w:hAnsi="Metropolis" w:cs="Metropolis"/>
-        </w:rPr>
-        <w:t xml:space="preserve">incluindo-se horas técnicas, logística impostos e taxas administrativas. A forma de pagamento está apresentada no </w:t>
+        <w:t xml:space="preserve">{{PRECO_TOTAL}}</w:t>
+      </w:r>
+      <w:r>
+        <w:rPr>
+          <w:rFonts w:ascii="Metropolis" w:eastAsia="Metropolis" w:hAnsi="Metropolis" w:cs="Metropolis"/>
+        </w:rPr>
+        <w:t xml:space="preserve">, incluindo-se horas técnicas, logísticas, impostos e taxas administrativas. A forma de pagamento está apresentada no </w:t>
       </w:r>
       <w:r>
         <w:rPr>
           <w:rFonts w:ascii="Metropolis" w:eastAsia="Metropolis" w:hAnsi="Metropolis" w:cs="Metropolis"/>
           <w:b/>
         </w:rPr>
-        <w:t>Quadro 10-2</w:t>
+        <w:t>Quadro 10-1</w:t>
       </w:r>
       <w:r>
         <w:rPr>
@@ -5607,6 +5410,15 @@
         </w:rPr>
         <w:t>.</w:t>
       </w:r>
+    </w:p>
+    <w:p>
+      <w:pPr>
+        <w:spacing w:after="0" w:line="360" w:lineRule="auto"/>
+        <w:jc w:val="both"/>
+        <w:rPr>
+          <w:rFonts w:ascii="Metropolis" w:eastAsia="Metropolis" w:hAnsi="Metropolis" w:cs="Metropolis"/>
+        </w:rPr>
+      </w:pPr>
     </w:p>
     <w:p>
       <w:pPr>
@@ -5631,368 +5443,17 @@
         <w:rPr>
           <w:rFonts w:ascii="Metropolis" w:eastAsia="Metropolis" w:hAnsi="Metropolis" w:cs="Metropolis"/>
           <w:color w:val="000000"/>
+        </w:rPr>
+      </w:pPr>
+      <w:r>
+        <w:rPr>
+          <w:rFonts w:ascii="Metropolis" w:eastAsia="Metropolis" w:hAnsi="Metropolis" w:cs="Metropolis"/>
+          <w:b/>
+          <w:color w:val="000000"/>
           <w:sz w:val="20"/>
           <w:szCs w:val="20"/>
         </w:rPr>
-      </w:pPr>
-      <w:r>
-        <w:rPr>
-          <w:rFonts w:ascii="Metropolis" w:eastAsia="Metropolis" w:hAnsi="Metropolis" w:cs="Metropolis"/>
-          <w:b/>
-          <w:color w:val="000000"/>
-          <w:sz w:val="20"/>
-          <w:szCs w:val="20"/>
-        </w:rPr>
         <w:t>Quadro 10-1</w:t>
-      </w:r>
-      <w:r>
-        <w:rPr>
-          <w:rFonts w:ascii="Metropolis" w:eastAsia="Metropolis" w:hAnsi="Metropolis" w:cs="Metropolis"/>
-          <w:color w:val="000000"/>
-          <w:sz w:val="20"/>
-          <w:szCs w:val="20"/>
-        </w:rPr>
-        <w:t>: Preço</w:t>
-      </w:r>
-    </w:p>
-    <w:tbl>
-      <w:tblPr>
-        <w:tblStyle w:val="a2"/>
-        <w:tblW w:w="8425" w:type="dxa"/>
-        <w:tblInd w:w="75" w:type="dxa"/>
-        <w:tblBorders>
-          <w:top w:val="single" w:sz="4" w:space="0" w:color="000000"/>
-          <w:left w:val="single" w:sz="4" w:space="0" w:color="000000"/>
-          <w:bottom w:val="single" w:sz="4" w:space="0" w:color="000000"/>
-          <w:right w:val="single" w:sz="4" w:space="0" w:color="000000"/>
-          <w:insideH w:val="single" w:sz="4" w:space="0" w:color="000000"/>
-          <w:insideV w:val="single" w:sz="4" w:space="0" w:color="000000"/>
-        </w:tblBorders>
-        <w:tblLayout w:type="fixed"/>
-        <w:tblLook w:val="0400" w:firstRow="0" w:lastRow="0" w:firstColumn="0" w:lastColumn="0" w:noHBand="0" w:noVBand="1"/>
-      </w:tblPr>
-      <w:tblGrid>
-        <w:gridCol w:w="487"/>
-        <w:gridCol w:w="6237"/>
-        <w:gridCol w:w="1701"/>
-      </w:tblGrid>
-      <w:tr>
-        <w:trPr>
-          <w:trHeight w:val="217"/>
-        </w:trPr>
-        <w:tc>
-          <w:tcPr>
-            <w:tcW w:w="487" w:type="dxa"/>
-            <w:vAlign w:val="center"/>
-          </w:tcPr>
-          <w:p>
-            <w:pPr>
-              <w:spacing w:after="0" w:line="360" w:lineRule="auto"/>
-              <w:jc w:val="both"/>
-              <w:rPr>
-                <w:rFonts w:ascii="Metropolis" w:eastAsia="Metropolis" w:hAnsi="Metropolis" w:cs="Metropolis"/>
-                <w:b/>
-                <w:sz w:val="20"/>
-                <w:szCs w:val="20"/>
-              </w:rPr>
-            </w:pPr>
-            <w:r>
-              <w:rPr>
-                <w:rFonts w:ascii="Metropolis" w:eastAsia="Metropolis" w:hAnsi="Metropolis" w:cs="Metropolis"/>
-                <w:b/>
-                <w:sz w:val="20"/>
-                <w:szCs w:val="20"/>
-              </w:rPr>
-              <w:t>N</w:t>
-            </w:r>
-            <w:r>
-              <w:rPr>
-                <w:b/>
-                <w:sz w:val="20"/>
-                <w:szCs w:val="20"/>
-              </w:rPr>
-              <w:t>°</w:t>
-            </w:r>
-          </w:p>
-        </w:tc>
-        <w:tc>
-          <w:tcPr>
-            <w:tcW w:w="6237" w:type="dxa"/>
-            <w:vAlign w:val="center"/>
-          </w:tcPr>
-          <w:p>
-            <w:pPr>
-              <w:spacing w:after="0" w:line="360" w:lineRule="auto"/>
-              <w:jc w:val="both"/>
-              <w:rPr>
-                <w:rFonts w:ascii="Metropolis" w:eastAsia="Metropolis" w:hAnsi="Metropolis" w:cs="Metropolis"/>
-                <w:b/>
-                <w:sz w:val="20"/>
-                <w:szCs w:val="20"/>
-              </w:rPr>
-            </w:pPr>
-            <w:r>
-              <w:rPr>
-                <w:rFonts w:ascii="Metropolis" w:eastAsia="Metropolis" w:hAnsi="Metropolis" w:cs="Metropolis"/>
-                <w:b/>
-                <w:sz w:val="20"/>
-                <w:szCs w:val="20"/>
-              </w:rPr>
-              <w:t>DESCRIÇÃO</w:t>
-            </w:r>
-          </w:p>
-        </w:tc>
-        <w:tc>
-          <w:tcPr>
-            <w:tcW w:w="1701" w:type="dxa"/>
-          </w:tcPr>
-          <w:p>
-            <w:pPr>
-              <w:spacing w:after="0" w:line="360" w:lineRule="auto"/>
-              <w:jc w:val="both"/>
-              <w:rPr>
-                <w:rFonts w:ascii="Metropolis" w:eastAsia="Metropolis" w:hAnsi="Metropolis" w:cs="Metropolis"/>
-                <w:b/>
-                <w:sz w:val="20"/>
-                <w:szCs w:val="20"/>
-              </w:rPr>
-            </w:pPr>
-            <w:r>
-              <w:rPr>
-                <w:rFonts w:ascii="Metropolis" w:eastAsia="Metropolis" w:hAnsi="Metropolis" w:cs="Metropolis"/>
-                <w:b/>
-                <w:sz w:val="20"/>
-                <w:szCs w:val="20"/>
-              </w:rPr>
-              <w:t>PREÇO R$</w:t>
-            </w:r>
-          </w:p>
-        </w:tc>
-      </w:tr>
-      <w:tr>
-        <w:trPr>
-          <w:trHeight w:val="276"/>
-        </w:trPr>
-        <w:tc>
-          <w:tcPr>
-            <w:tcW w:w="487" w:type="dxa"/>
-            <w:vAlign w:val="center"/>
-          </w:tcPr>
-          <w:p>
-            <w:pPr>
-              <w:spacing w:after="0" w:line="360" w:lineRule="auto"/>
-              <w:jc w:val="both"/>
-              <w:rPr>
-                <w:rFonts w:ascii="Metropolis" w:eastAsia="Metropolis" w:hAnsi="Metropolis" w:cs="Metropolis"/>
-                <w:sz w:val="20"/>
-                <w:szCs w:val="20"/>
-              </w:rPr>
-            </w:pPr>
-            <w:r>
-              <w:rPr>
-                <w:rFonts w:ascii="Metropolis" w:eastAsia="Metropolis" w:hAnsi="Metropolis" w:cs="Metropolis"/>
-                <w:sz w:val="20"/>
-                <w:szCs w:val="20"/>
-              </w:rPr>
-              <w:t>1</w:t>
-            </w:r>
-          </w:p>
-        </w:tc>
-        <w:tc>
-          <w:tcPr>
-            <w:tcW w:w="6237" w:type="dxa"/>
-            <w:vAlign w:val="center"/>
-          </w:tcPr>
-          <w:p>
-            <w:pPr>
-              <w:spacing w:after="0" w:line="360" w:lineRule="auto"/>
-              <w:jc w:val="both"/>
-              <w:rPr>
-                <w:rFonts w:ascii="Metropolis" w:eastAsia="Metropolis" w:hAnsi="Metropolis" w:cs="Metropolis"/>
-                <w:sz w:val="20"/>
-                <w:szCs w:val="20"/>
-              </w:rPr>
-            </w:pPr>
-          </w:p>
-        </w:tc>
-        <w:tc>
-          <w:tcPr>
-            <w:tcW w:w="1701" w:type="dxa"/>
-          </w:tcPr>
-          <w:p>
-            <w:pPr>
-              <w:spacing w:after="0" w:line="360" w:lineRule="auto"/>
-              <w:jc w:val="both"/>
-              <w:rPr>
-                <w:rFonts w:ascii="Metropolis" w:eastAsia="Metropolis" w:hAnsi="Metropolis" w:cs="Metropolis"/>
-                <w:sz w:val="20"/>
-                <w:szCs w:val="20"/>
-              </w:rPr>
-            </w:pPr>
-          </w:p>
-        </w:tc>
-      </w:tr>
-      <w:tr>
-        <w:trPr>
-          <w:trHeight w:val="276"/>
-        </w:trPr>
-        <w:tc>
-          <w:tcPr>
-            <w:tcW w:w="487" w:type="dxa"/>
-            <w:vAlign w:val="center"/>
-          </w:tcPr>
-          <w:p>
-            <w:pPr>
-              <w:spacing w:after="0" w:line="360" w:lineRule="auto"/>
-              <w:jc w:val="both"/>
-              <w:rPr>
-                <w:rFonts w:ascii="Metropolis" w:eastAsia="Metropolis" w:hAnsi="Metropolis" w:cs="Metropolis"/>
-                <w:sz w:val="20"/>
-                <w:szCs w:val="20"/>
-              </w:rPr>
-            </w:pPr>
-            <w:r>
-              <w:rPr>
-                <w:rFonts w:ascii="Metropolis" w:eastAsia="Metropolis" w:hAnsi="Metropolis" w:cs="Metropolis"/>
-                <w:sz w:val="20"/>
-                <w:szCs w:val="20"/>
-              </w:rPr>
-              <w:t>2</w:t>
-            </w:r>
-          </w:p>
-        </w:tc>
-        <w:tc>
-          <w:tcPr>
-            <w:tcW w:w="6237" w:type="dxa"/>
-            <w:vAlign w:val="center"/>
-          </w:tcPr>
-          <w:p>
-            <w:pPr>
-              <w:spacing w:after="0" w:line="360" w:lineRule="auto"/>
-              <w:jc w:val="both"/>
-              <w:rPr>
-                <w:rFonts w:ascii="Metropolis" w:eastAsia="Metropolis" w:hAnsi="Metropolis" w:cs="Metropolis"/>
-                <w:sz w:val="20"/>
-                <w:szCs w:val="20"/>
-              </w:rPr>
-            </w:pPr>
-          </w:p>
-        </w:tc>
-        <w:tc>
-          <w:tcPr>
-            <w:tcW w:w="1701" w:type="dxa"/>
-          </w:tcPr>
-          <w:p>
-            <w:pPr>
-              <w:spacing w:after="0" w:line="360" w:lineRule="auto"/>
-              <w:jc w:val="both"/>
-              <w:rPr>
-                <w:rFonts w:ascii="Metropolis" w:eastAsia="Metropolis" w:hAnsi="Metropolis" w:cs="Metropolis"/>
-                <w:sz w:val="20"/>
-                <w:szCs w:val="20"/>
-              </w:rPr>
-            </w:pPr>
-          </w:p>
-        </w:tc>
-      </w:tr>
-      <w:tr>
-        <w:trPr>
-          <w:trHeight w:val="276"/>
-        </w:trPr>
-        <w:tc>
-          <w:tcPr>
-            <w:tcW w:w="487" w:type="dxa"/>
-            <w:vAlign w:val="center"/>
-          </w:tcPr>
-          <w:p>
-            <w:pPr>
-              <w:spacing w:after="0" w:line="360" w:lineRule="auto"/>
-              <w:jc w:val="both"/>
-              <w:rPr>
-                <w:rFonts w:ascii="Metropolis" w:eastAsia="Metropolis" w:hAnsi="Metropolis" w:cs="Metropolis"/>
-                <w:sz w:val="20"/>
-                <w:szCs w:val="20"/>
-              </w:rPr>
-            </w:pPr>
-            <w:r>
-              <w:rPr>
-                <w:rFonts w:ascii="Metropolis" w:eastAsia="Metropolis" w:hAnsi="Metropolis" w:cs="Metropolis"/>
-                <w:sz w:val="20"/>
-                <w:szCs w:val="20"/>
-              </w:rPr>
-              <w:t>3</w:t>
-            </w:r>
-          </w:p>
-        </w:tc>
-        <w:tc>
-          <w:tcPr>
-            <w:tcW w:w="6237" w:type="dxa"/>
-            <w:vAlign w:val="center"/>
-          </w:tcPr>
-          <w:p>
-            <w:pPr>
-              <w:spacing w:after="0" w:line="360" w:lineRule="auto"/>
-              <w:jc w:val="both"/>
-              <w:rPr>
-                <w:rFonts w:ascii="Metropolis" w:eastAsia="Metropolis" w:hAnsi="Metropolis" w:cs="Metropolis"/>
-                <w:sz w:val="20"/>
-                <w:szCs w:val="20"/>
-              </w:rPr>
-            </w:pPr>
-          </w:p>
-        </w:tc>
-        <w:tc>
-          <w:tcPr>
-            <w:tcW w:w="1701" w:type="dxa"/>
-          </w:tcPr>
-          <w:p>
-            <w:pPr>
-              <w:spacing w:after="0" w:line="360" w:lineRule="auto"/>
-              <w:jc w:val="both"/>
-              <w:rPr>
-                <w:rFonts w:ascii="Metropolis" w:eastAsia="Metropolis" w:hAnsi="Metropolis" w:cs="Metropolis"/>
-                <w:sz w:val="20"/>
-                <w:szCs w:val="20"/>
-              </w:rPr>
-            </w:pPr>
-          </w:p>
-        </w:tc>
-      </w:tr>
-    </w:tbl>
-    <w:p>
-      <w:pPr>
-        <w:spacing w:after="0" w:line="360" w:lineRule="auto"/>
-        <w:jc w:val="both"/>
-        <w:rPr>
-          <w:rFonts w:ascii="Metropolis" w:eastAsia="Metropolis" w:hAnsi="Metropolis" w:cs="Metropolis"/>
-        </w:rPr>
-      </w:pPr>
-    </w:p>
-    <w:p>
-      <w:pPr>
-        <w:pBdr>
-          <w:top w:val="nil"/>
-          <w:left w:val="nil"/>
-          <w:bottom w:val="nil"/>
-          <w:right w:val="nil"/>
-          <w:between w:val="nil"/>
-        </w:pBdr>
-        <w:spacing w:after="0" w:line="360" w:lineRule="auto"/>
-        <w:jc w:val="both"/>
-        <w:rPr>
-          <w:rFonts w:ascii="Metropolis" w:eastAsia="Metropolis" w:hAnsi="Metropolis" w:cs="Metropolis"/>
-          <w:color w:val="000000"/>
-        </w:rPr>
-      </w:pPr>
-      <w:r>
-        <w:rPr>
-          <w:rFonts w:ascii="Metropolis" w:eastAsia="Metropolis" w:hAnsi="Metropolis" w:cs="Metropolis"/>
-          <w:b/>
-          <w:color w:val="000000"/>
-          <w:sz w:val="20"/>
-          <w:szCs w:val="20"/>
-        </w:rPr>
-        <w:t>Quadro 10-2</w:t>
       </w:r>
       <w:r>
         <w:rPr>
@@ -6022,7 +5483,8 @@
       </w:tblPr>
       <w:tblGrid>
         <w:gridCol w:w="501"/>
-        <w:gridCol w:w="6243"/>
+        <w:gridCol w:w="4542"/>
+        <w:gridCol w:w="1701"/>
         <w:gridCol w:w="1701"/>
       </w:tblGrid>
       <w:tr>
@@ -6067,7 +5529,7 @@
         </w:tc>
         <w:tc>
           <w:tcPr>
-            <w:tcW w:w="6243" w:type="dxa"/>
+            <w:tcW w:w="4542" w:type="dxa"/>
             <w:vAlign w:val="center"/>
           </w:tcPr>
           <w:p>
@@ -6115,7 +5577,34 @@
                 <w:sz w:val="20"/>
                 <w:szCs w:val="20"/>
               </w:rPr>
-              <w:t>% DO ITEM</w:t>
+              <w:t>R$</w:t>
+            </w:r>
+          </w:p>
+        </w:tc>
+        <w:tc>
+          <w:tcPr>
+            <w:tcW w:w="1701" w:type="dxa"/>
+            <w:vAlign w:val="center"/>
+          </w:tcPr>
+          <w:p>
+            <w:pPr>
+              <w:spacing w:after="0" w:line="360" w:lineRule="auto"/>
+              <w:jc w:val="center"/>
+              <w:rPr>
+                <w:rFonts w:ascii="Metropolis" w:eastAsia="Metropolis" w:hAnsi="Metropolis" w:cs="Metropolis"/>
+                <w:b/>
+                <w:sz w:val="20"/>
+                <w:szCs w:val="20"/>
+              </w:rPr>
+            </w:pPr>
+            <w:r>
+              <w:rPr>
+                <w:rFonts w:ascii="Metropolis" w:eastAsia="Metropolis" w:hAnsi="Metropolis" w:cs="Metropolis"/>
+                <w:b/>
+                <w:sz w:val="20"/>
+                <w:szCs w:val="20"/>
+              </w:rPr>
+              <w:t>DATA</w:t>
             </w:r>
           </w:p>
         </w:tc>
@@ -6151,12 +5640,29 @@
         </w:tc>
         <w:tc>
           <w:tcPr>
-            <w:tcW w:w="6243" w:type="dxa"/>
+            <w:tcW w:w="4542" w:type="dxa"/>
             <w:vAlign w:val="center"/>
           </w:tcPr>
           <w:p>
             <w:pPr>
               <w:spacing w:after="0"/>
+              <w:rPr>
+                <w:rFonts w:ascii="Metropolis" w:eastAsia="Metropolis" w:hAnsi="Metropolis" w:cs="Metropolis"/>
+                <w:sz w:val="20"/>
+                <w:szCs w:val="20"/>
+              </w:rPr>
+            </w:pPr>
+          </w:p>
+        </w:tc>
+        <w:tc>
+          <w:tcPr>
+            <w:tcW w:w="1701" w:type="dxa"/>
+            <w:vAlign w:val="center"/>
+          </w:tcPr>
+          <w:p>
+            <w:pPr>
+              <w:spacing w:after="0"/>
+              <w:jc w:val="center"/>
               <w:rPr>
                 <w:rFonts w:ascii="Metropolis" w:eastAsia="Metropolis" w:hAnsi="Metropolis" w:cs="Metropolis"/>
                 <w:sz w:val="20"/>
@@ -6214,12 +5720,29 @@
         </w:tc>
         <w:tc>
           <w:tcPr>
-            <w:tcW w:w="6243" w:type="dxa"/>
+            <w:tcW w:w="4542" w:type="dxa"/>
             <w:vAlign w:val="center"/>
           </w:tcPr>
           <w:p>
             <w:pPr>
               <w:spacing w:after="0"/>
+              <w:rPr>
+                <w:rFonts w:ascii="Metropolis" w:eastAsia="Metropolis" w:hAnsi="Metropolis" w:cs="Metropolis"/>
+                <w:sz w:val="20"/>
+                <w:szCs w:val="20"/>
+              </w:rPr>
+            </w:pPr>
+          </w:p>
+        </w:tc>
+        <w:tc>
+          <w:tcPr>
+            <w:tcW w:w="1701" w:type="dxa"/>
+            <w:vAlign w:val="center"/>
+          </w:tcPr>
+          <w:p>
+            <w:pPr>
+              <w:spacing w:after="0"/>
+              <w:jc w:val="center"/>
               <w:rPr>
                 <w:rFonts w:ascii="Metropolis" w:eastAsia="Metropolis" w:hAnsi="Metropolis" w:cs="Metropolis"/>
                 <w:sz w:val="20"/>
@@ -6277,12 +5800,29 @@
         </w:tc>
         <w:tc>
           <w:tcPr>
-            <w:tcW w:w="6243" w:type="dxa"/>
+            <w:tcW w:w="4542" w:type="dxa"/>
             <w:vAlign w:val="center"/>
           </w:tcPr>
           <w:p>
             <w:pPr>
               <w:spacing w:after="0"/>
+              <w:rPr>
+                <w:rFonts w:ascii="Metropolis" w:eastAsia="Metropolis" w:hAnsi="Metropolis" w:cs="Metropolis"/>
+                <w:sz w:val="20"/>
+                <w:szCs w:val="20"/>
+              </w:rPr>
+            </w:pPr>
+          </w:p>
+        </w:tc>
+        <w:tc>
+          <w:tcPr>
+            <w:tcW w:w="1701" w:type="dxa"/>
+            <w:vAlign w:val="center"/>
+          </w:tcPr>
+          <w:p>
+            <w:pPr>
+              <w:spacing w:after="0"/>
+              <w:jc w:val="center"/>
               <w:rPr>
                 <w:rFonts w:ascii="Metropolis" w:eastAsia="Metropolis" w:hAnsi="Metropolis" w:cs="Metropolis"/>
                 <w:sz w:val="20"/>
@@ -6340,12 +5880,29 @@
         </w:tc>
         <w:tc>
           <w:tcPr>
-            <w:tcW w:w="6243" w:type="dxa"/>
+            <w:tcW w:w="4542" w:type="dxa"/>
             <w:vAlign w:val="center"/>
           </w:tcPr>
           <w:p>
             <w:pPr>
               <w:spacing w:after="0"/>
+              <w:rPr>
+                <w:rFonts w:ascii="Metropolis" w:eastAsia="Metropolis" w:hAnsi="Metropolis" w:cs="Metropolis"/>
+                <w:sz w:val="20"/>
+                <w:szCs w:val="20"/>
+              </w:rPr>
+            </w:pPr>
+          </w:p>
+        </w:tc>
+        <w:tc>
+          <w:tcPr>
+            <w:tcW w:w="1701" w:type="dxa"/>
+            <w:vAlign w:val="center"/>
+          </w:tcPr>
+          <w:p>
+            <w:pPr>
+              <w:spacing w:after="0"/>
+              <w:jc w:val="center"/>
               <w:rPr>
                 <w:rFonts w:ascii="Metropolis" w:eastAsia="Metropolis" w:hAnsi="Metropolis" w:cs="Metropolis"/>
                 <w:sz w:val="20"/>
@@ -6403,12 +5960,30 @@
         </w:tc>
         <w:tc>
           <w:tcPr>
-            <w:tcW w:w="6243" w:type="dxa"/>
+            <w:tcW w:w="4542" w:type="dxa"/>
             <w:vAlign w:val="center"/>
           </w:tcPr>
           <w:p>
             <w:pPr>
               <w:spacing w:after="0"/>
+              <w:rPr>
+                <w:rFonts w:ascii="Metropolis" w:eastAsia="Metropolis" w:hAnsi="Metropolis" w:cs="Metropolis"/>
+                <w:color w:val="000000"/>
+                <w:sz w:val="20"/>
+                <w:szCs w:val="20"/>
+              </w:rPr>
+            </w:pPr>
+          </w:p>
+        </w:tc>
+        <w:tc>
+          <w:tcPr>
+            <w:tcW w:w="1701" w:type="dxa"/>
+            <w:vAlign w:val="center"/>
+          </w:tcPr>
+          <w:p>
+            <w:pPr>
+              <w:spacing w:after="0"/>
+              <w:jc w:val="center"/>
               <w:rPr>
                 <w:rFonts w:ascii="Metropolis" w:eastAsia="Metropolis" w:hAnsi="Metropolis" w:cs="Metropolis"/>
                 <w:color w:val="000000"/>
@@ -6468,12 +6043,30 @@
         </w:tc>
         <w:tc>
           <w:tcPr>
-            <w:tcW w:w="6243" w:type="dxa"/>
+            <w:tcW w:w="4542" w:type="dxa"/>
             <w:vAlign w:val="center"/>
           </w:tcPr>
           <w:p>
             <w:pPr>
               <w:spacing w:after="0"/>
+              <w:rPr>
+                <w:rFonts w:ascii="Metropolis" w:eastAsia="Metropolis" w:hAnsi="Metropolis" w:cs="Metropolis"/>
+                <w:color w:val="000000"/>
+                <w:sz w:val="20"/>
+                <w:szCs w:val="20"/>
+              </w:rPr>
+            </w:pPr>
+          </w:p>
+        </w:tc>
+        <w:tc>
+          <w:tcPr>
+            <w:tcW w:w="1701" w:type="dxa"/>
+            <w:vAlign w:val="center"/>
+          </w:tcPr>
+          <w:p>
+            <w:pPr>
+              <w:spacing w:after="0"/>
+              <w:jc w:val="center"/>
               <w:rPr>
                 <w:rFonts w:ascii="Metropolis" w:eastAsia="Metropolis" w:hAnsi="Metropolis" w:cs="Metropolis"/>
                 <w:color w:val="000000"/>
@@ -6533,12 +6126,30 @@
         </w:tc>
         <w:tc>
           <w:tcPr>
-            <w:tcW w:w="6243" w:type="dxa"/>
+            <w:tcW w:w="4542" w:type="dxa"/>
             <w:vAlign w:val="center"/>
           </w:tcPr>
           <w:p>
             <w:pPr>
               <w:spacing w:after="0"/>
+              <w:rPr>
+                <w:rFonts w:ascii="Metropolis" w:eastAsia="Metropolis" w:hAnsi="Metropolis" w:cs="Metropolis"/>
+                <w:color w:val="000000"/>
+                <w:sz w:val="20"/>
+                <w:szCs w:val="20"/>
+              </w:rPr>
+            </w:pPr>
+          </w:p>
+        </w:tc>
+        <w:tc>
+          <w:tcPr>
+            <w:tcW w:w="1701" w:type="dxa"/>
+            <w:vAlign w:val="center"/>
+          </w:tcPr>
+          <w:p>
+            <w:pPr>
+              <w:spacing w:after="0"/>
+              <w:jc w:val="center"/>
               <w:rPr>
                 <w:rFonts w:ascii="Metropolis" w:eastAsia="Metropolis" w:hAnsi="Metropolis" w:cs="Metropolis"/>
                 <w:color w:val="000000"/>
@@ -6598,12 +6209,30 @@
         </w:tc>
         <w:tc>
           <w:tcPr>
-            <w:tcW w:w="6243" w:type="dxa"/>
+            <w:tcW w:w="4542" w:type="dxa"/>
             <w:vAlign w:val="center"/>
           </w:tcPr>
           <w:p>
             <w:pPr>
               <w:spacing w:after="0"/>
+              <w:rPr>
+                <w:rFonts w:ascii="Metropolis" w:eastAsia="Metropolis" w:hAnsi="Metropolis" w:cs="Metropolis"/>
+                <w:color w:val="000000"/>
+                <w:sz w:val="20"/>
+                <w:szCs w:val="20"/>
+              </w:rPr>
+            </w:pPr>
+          </w:p>
+        </w:tc>
+        <w:tc>
+          <w:tcPr>
+            <w:tcW w:w="1701" w:type="dxa"/>
+            <w:vAlign w:val="center"/>
+          </w:tcPr>
+          <w:p>
+            <w:pPr>
+              <w:spacing w:after="0"/>
+              <w:jc w:val="center"/>
               <w:rPr>
                 <w:rFonts w:ascii="Metropolis" w:eastAsia="Metropolis" w:hAnsi="Metropolis" w:cs="Metropolis"/>
                 <w:color w:val="000000"/>
@@ -6663,12 +6292,30 @@
         </w:tc>
         <w:tc>
           <w:tcPr>
-            <w:tcW w:w="6243" w:type="dxa"/>
+            <w:tcW w:w="4542" w:type="dxa"/>
             <w:vAlign w:val="center"/>
           </w:tcPr>
           <w:p>
             <w:pPr>
               <w:spacing w:after="0"/>
+              <w:rPr>
+                <w:rFonts w:ascii="Metropolis" w:eastAsia="Metropolis" w:hAnsi="Metropolis" w:cs="Metropolis"/>
+                <w:color w:val="000000"/>
+                <w:sz w:val="20"/>
+                <w:szCs w:val="20"/>
+              </w:rPr>
+            </w:pPr>
+          </w:p>
+        </w:tc>
+        <w:tc>
+          <w:tcPr>
+            <w:tcW w:w="1701" w:type="dxa"/>
+            <w:vAlign w:val="center"/>
+          </w:tcPr>
+          <w:p>
+            <w:pPr>
+              <w:spacing w:after="0"/>
+              <w:jc w:val="center"/>
               <w:rPr>
                 <w:rFonts w:ascii="Metropolis" w:eastAsia="Metropolis" w:hAnsi="Metropolis" w:cs="Metropolis"/>
                 <w:color w:val="000000"/>

</xml_diff>

<commit_message>
fix: corrige validade proposta e topicos no item 5
</commit_message>
<xml_diff>
--- a/app/templates/docx/proposta_tecnica_comercial.docx
+++ b/app/templates/docx/proposta_tecnica_comercial.docx
@@ -3652,6 +3652,25 @@
     </w:p>
     <w:p>
       <w:pPr>
+        <w:numPr>
+          <w:ilvl w:val="0"/>
+          <w:numId w:val="2"/>
+        </w:numPr>
+        <w:spacing w:after="0" w:line="360" w:lineRule="auto"/>
+        <w:jc w:val="both"/>
+        <w:rPr>
+          <w:rFonts w:ascii="Metropolis" w:eastAsia="Metropolis" w:hAnsi="Metropolis" w:cs="Metropolis"/>
+        </w:rPr>
+      </w:pPr>
+      <w:r>
+        <w:rPr>
+          <w:rFonts w:ascii="Metropolis" w:eastAsia="Metropolis" w:hAnsi="Metropolis" w:cs="Metropolis"/>
+        </w:rPr>
+        <w:t>{{OBRIGACOES_PAPYRUS_ADICIONAIS}}</w:t>
+      </w:r>
+    </w:p>
+    <w:p>
+      <w:pPr>
         <w:rPr>
           <w:rFonts w:ascii="Metropolis" w:eastAsia="Metropolis" w:hAnsi="Metropolis" w:cs="Metropolis"/>
         </w:rPr>
@@ -3980,6 +3999,26 @@
           <w:rFonts w:ascii="Metropolis" w:eastAsia="Metropolis" w:hAnsi="Metropolis" w:cs="Metropolis"/>
         </w:rPr>
         <w:t>Disponibilizar a Lista de stakeholders.</w:t>
+      </w:r>
+    </w:p>
+    <w:p>
+      <w:pPr>
+        <w:numPr>
+          <w:ilvl w:val="0"/>
+          <w:numId w:val="3"/>
+        </w:numPr>
+        <w:spacing w:after="0" w:line="360" w:lineRule="auto"/>
+        <w:ind w:left="0" w:firstLine="0"/>
+        <w:jc w:val="both"/>
+        <w:rPr>
+          <w:rFonts w:ascii="Metropolis" w:eastAsia="Metropolis" w:hAnsi="Metropolis" w:cs="Metropolis"/>
+        </w:rPr>
+      </w:pPr>
+      <w:r>
+        <w:rPr>
+          <w:rFonts w:ascii="Metropolis" w:eastAsia="Metropolis" w:hAnsi="Metropolis" w:cs="Metropolis"/>
+        </w:rPr>
+        <w:t>{{OBRIGACOES_CONTRATANTE_ADICIONAIS}}</w:t>
       </w:r>
     </w:p>
     <w:p>
@@ -5321,6 +5360,32 @@
     </w:p>
     <w:p>
       <w:pPr>
+        <w:pStyle w:val="Ttulo1"/>
+        <w:numPr>
+          <w:ilvl w:val="0"/>
+          <w:numId w:val="1"/>
+        </w:numPr>
+        <w:spacing w:before="0" w:after="0" w:line="360" w:lineRule="auto"/>
+        <w:ind w:left="0" w:hanging="11"/>
+        <w:jc w:val="both"/>
+        <w:rPr>
+          <w:rFonts w:ascii="Metropolis" w:eastAsia="Metropolis" w:hAnsi="Metropolis" w:cs="Metropolis"/>
+          <w:sz w:val="22"/>
+          <w:szCs w:val="22"/>
+        </w:rPr>
+      </w:pPr>
+      <w:r>
+        <w:rPr>
+          <w:rFonts w:ascii="Metropolis" w:eastAsia="Metropolis" w:hAnsi="Metropolis" w:cs="Metropolis"/>
+          <w:sz w:val="22"/>
+          <w:szCs w:val="22"/>
+        </w:rPr>
+        <w:lastRenderedPageBreak/>
+        <w:t>VALIDADE DA PROPOSTA</w:t>
+      </w:r>
+    </w:p>
+    <w:p>
+      <w:pPr>
         <w:pBdr>
           <w:top w:val="nil"/>
           <w:left w:val="nil"/>
@@ -5338,6 +5403,91 @@
     </w:p>
     <w:p>
       <w:pPr>
+        <w:pBdr>
+          <w:top w:val="nil"/>
+          <w:left w:val="nil"/>
+          <w:bottom w:val="nil"/>
+          <w:right w:val="nil"/>
+          <w:between w:val="nil"/>
+        </w:pBdr>
+        <w:spacing w:after="0" w:line="360" w:lineRule="auto"/>
+        <w:jc w:val="both"/>
+        <w:rPr>
+          <w:rFonts w:ascii="Metropolis" w:eastAsia="Metropolis" w:hAnsi="Metropolis" w:cs="Metropolis"/>
+          <w:color w:val="000000"/>
+        </w:rPr>
+      </w:pPr>
+      <w:r>
+        <w:rPr>
+          <w:rFonts w:ascii="Metropolis" w:eastAsia="Metropolis" w:hAnsi="Metropolis" w:cs="Metropolis"/>
+          <w:color w:val="000000"/>
+        </w:rPr>
+        <w:t>Esta proposta tem validade de 90 dias.</w:t>
+      </w:r>
+    </w:p>
+    <w:p>
+      <w:pPr>
+        <w:pBdr>
+          <w:top w:val="nil"/>
+          <w:left w:val="nil"/>
+          <w:bottom w:val="nil"/>
+          <w:right w:val="nil"/>
+          <w:between w:val="nil"/>
+        </w:pBdr>
+        <w:spacing w:after="0" w:line="360" w:lineRule="auto"/>
+        <w:jc w:val="both"/>
+        <w:rPr>
+          <w:rFonts w:ascii="Metropolis" w:eastAsia="Metropolis" w:hAnsi="Metropolis" w:cs="Metropolis"/>
+          <w:color w:val="000000"/>
+        </w:rPr>
+      </w:pPr>
+    </w:p>
+    <w:p>
+      <w:pPr>
+        <w:spacing w:after="0" w:line="360" w:lineRule="auto"/>
+        <w:jc w:val="both"/>
+        <w:rPr>
+          <w:rFonts w:ascii="Metropolis" w:eastAsia="Metropolis" w:hAnsi="Metropolis" w:cs="Metropolis"/>
+          <w:b/>
+        </w:rPr>
+      </w:pPr>
+    </w:p>
+    <w:p>
+      <w:pPr>
+        <w:spacing w:after="0" w:line="360" w:lineRule="auto"/>
+        <w:jc w:val="both"/>
+        <w:rPr>
+          <w:rFonts w:ascii="Metropolis" w:eastAsia="Metropolis" w:hAnsi="Metropolis" w:cs="Metropolis"/>
+          <w:b/>
+        </w:rPr>
+      </w:pPr>
+      <w:r>
+        <w:rPr>
+          <w:rFonts w:ascii="Metropolis" w:eastAsia="Metropolis" w:hAnsi="Metropolis" w:cs="Metropolis"/>
+          <w:b/>
+        </w:rPr>
+        <w:t>Data do aceite da proposta: ______________________</w:t>
+      </w:r>
+    </w:p>
+    <w:p>
+      <w:pPr>
+        <w:pBdr>
+          <w:top w:val="nil"/>
+          <w:left w:val="nil"/>
+          <w:bottom w:val="nil"/>
+          <w:right w:val="nil"/>
+          <w:between w:val="nil"/>
+        </w:pBdr>
+        <w:spacing w:after="0" w:line="360" w:lineRule="auto"/>
+        <w:jc w:val="both"/>
+        <w:rPr>
+          <w:rFonts w:ascii="Metropolis" w:eastAsia="Metropolis" w:hAnsi="Metropolis" w:cs="Metropolis"/>
+          <w:color w:val="000000"/>
+        </w:rPr>
+      </w:pPr>
+    </w:p>
+    <w:p>
+      <w:pPr>
         <w:pStyle w:val="Ttulo1"/>
         <w:numPr>
           <w:ilvl w:val="0"/>
@@ -5402,7 +5552,7 @@
           <w:rFonts w:ascii="Metropolis" w:eastAsia="Metropolis" w:hAnsi="Metropolis" w:cs="Metropolis"/>
           <w:b/>
         </w:rPr>
-        <w:t>Quadro 10-1</w:t>
+        <w:t>Quadro 11-1</w:t>
       </w:r>
       <w:r>
         <w:rPr>
@@ -5453,7 +5603,7 @@
           <w:sz w:val="20"/>
           <w:szCs w:val="20"/>
         </w:rPr>
-        <w:t>Quadro 10-1</w:t>
+        <w:t>Quadro 11-1</w:t>
       </w:r>
       <w:r>
         <w:rPr>
@@ -6502,117 +6652,6 @@
           <w:color w:val="000000"/>
         </w:rPr>
       </w:pPr>
-    </w:p>
-    <w:p>
-      <w:pPr>
-        <w:pStyle w:val="Ttulo1"/>
-        <w:numPr>
-          <w:ilvl w:val="0"/>
-          <w:numId w:val="1"/>
-        </w:numPr>
-        <w:spacing w:before="0" w:after="0" w:line="360" w:lineRule="auto"/>
-        <w:ind w:left="0" w:hanging="11"/>
-        <w:jc w:val="both"/>
-        <w:rPr>
-          <w:rFonts w:ascii="Metropolis" w:eastAsia="Metropolis" w:hAnsi="Metropolis" w:cs="Metropolis"/>
-          <w:sz w:val="22"/>
-          <w:szCs w:val="22"/>
-        </w:rPr>
-      </w:pPr>
-      <w:r>
-        <w:rPr>
-          <w:rFonts w:ascii="Metropolis" w:eastAsia="Metropolis" w:hAnsi="Metropolis" w:cs="Metropolis"/>
-          <w:sz w:val="22"/>
-          <w:szCs w:val="22"/>
-        </w:rPr>
-        <w:lastRenderedPageBreak/>
-        <w:t>VALIDADE DA PROPOSTA</w:t>
-      </w:r>
-    </w:p>
-    <w:p>
-      <w:pPr>
-        <w:pBdr>
-          <w:top w:val="nil"/>
-          <w:left w:val="nil"/>
-          <w:bottom w:val="nil"/>
-          <w:right w:val="nil"/>
-          <w:between w:val="nil"/>
-        </w:pBdr>
-        <w:spacing w:after="0" w:line="360" w:lineRule="auto"/>
-        <w:jc w:val="both"/>
-        <w:rPr>
-          <w:rFonts w:ascii="Metropolis" w:eastAsia="Metropolis" w:hAnsi="Metropolis" w:cs="Metropolis"/>
-          <w:color w:val="000000"/>
-        </w:rPr>
-      </w:pPr>
-    </w:p>
-    <w:p>
-      <w:pPr>
-        <w:pBdr>
-          <w:top w:val="nil"/>
-          <w:left w:val="nil"/>
-          <w:bottom w:val="nil"/>
-          <w:right w:val="nil"/>
-          <w:between w:val="nil"/>
-        </w:pBdr>
-        <w:spacing w:after="0" w:line="360" w:lineRule="auto"/>
-        <w:jc w:val="both"/>
-        <w:rPr>
-          <w:rFonts w:ascii="Metropolis" w:eastAsia="Metropolis" w:hAnsi="Metropolis" w:cs="Metropolis"/>
-          <w:color w:val="000000"/>
-        </w:rPr>
-      </w:pPr>
-      <w:r>
-        <w:rPr>
-          <w:rFonts w:ascii="Metropolis" w:eastAsia="Metropolis" w:hAnsi="Metropolis" w:cs="Metropolis"/>
-          <w:color w:val="000000"/>
-        </w:rPr>
-        <w:t>Esta proposta tem validade de 90 dias.</w:t>
-      </w:r>
-    </w:p>
-    <w:p>
-      <w:pPr>
-        <w:pBdr>
-          <w:top w:val="nil"/>
-          <w:left w:val="nil"/>
-          <w:bottom w:val="nil"/>
-          <w:right w:val="nil"/>
-          <w:between w:val="nil"/>
-        </w:pBdr>
-        <w:spacing w:after="0" w:line="360" w:lineRule="auto"/>
-        <w:jc w:val="both"/>
-        <w:rPr>
-          <w:rFonts w:ascii="Metropolis" w:eastAsia="Metropolis" w:hAnsi="Metropolis" w:cs="Metropolis"/>
-          <w:color w:val="000000"/>
-        </w:rPr>
-      </w:pPr>
-    </w:p>
-    <w:p>
-      <w:pPr>
-        <w:spacing w:after="0" w:line="360" w:lineRule="auto"/>
-        <w:jc w:val="both"/>
-        <w:rPr>
-          <w:rFonts w:ascii="Metropolis" w:eastAsia="Metropolis" w:hAnsi="Metropolis" w:cs="Metropolis"/>
-          <w:b/>
-        </w:rPr>
-      </w:pPr>
-    </w:p>
-    <w:p>
-      <w:pPr>
-        <w:spacing w:after="0" w:line="360" w:lineRule="auto"/>
-        <w:jc w:val="both"/>
-        <w:rPr>
-          <w:rFonts w:ascii="Metropolis" w:eastAsia="Metropolis" w:hAnsi="Metropolis" w:cs="Metropolis"/>
-          <w:b/>
-        </w:rPr>
-      </w:pPr>
-      <w:r>
-        <w:rPr>
-          <w:rFonts w:ascii="Metropolis" w:eastAsia="Metropolis" w:hAnsi="Metropolis" w:cs="Metropolis"/>
-          <w:b/>
-        </w:rPr>
-        <w:t>Data do aceite da proposta: ______________________</w:t>
-      </w:r>
     </w:p>
     <w:p>
       <w:pPr>

</xml_diff>

<commit_message>
feat: adiciona assinatura no final do docx
</commit_message>
<xml_diff>
--- a/app/templates/docx/proposta_tecnica_comercial.docx
+++ b/app/templates/docx/proposta_tecnica_comercial.docx
@@ -2947,12 +2947,16 @@
         <w:rPr>
           <w:rFonts w:ascii="Metropolis" w:eastAsia="Metropolis" w:hAnsi="Metropolis" w:cs="Metropolis"/>
           <w:b/>
+          <w:sz w:val="20"/>
+          <w:szCs w:val="20"/>
         </w:rPr>
         <w:t>Quadro 6-1:</w:t>
       </w:r>
       <w:r>
         <w:rPr>
           <w:rFonts w:ascii="Metropolis" w:eastAsia="Metropolis" w:hAnsi="Metropolis" w:cs="Metropolis"/>
+          <w:sz w:val="20"/>
+          <w:szCs w:val="20"/>
         </w:rPr>
         <w:t xml:space="preserve"> Produtos a serem entregues.</w:t>
       </w:r>
@@ -4087,16 +4091,12 @@
         <w:rPr>
           <w:rFonts w:ascii="Metropolis" w:eastAsia="Metropolis" w:hAnsi="Metropolis" w:cs="Metropolis"/>
           <w:color w:val="000000"/>
-          <w:sz w:val="20"/>
-          <w:szCs w:val="20"/>
-        </w:rPr>
-      </w:pPr>
-      <w:r>
-        <w:rPr>
-          <w:rFonts w:ascii="Metropolis" w:eastAsia="Metropolis" w:hAnsi="Metropolis" w:cs="Metropolis"/>
-          <w:color w:val="000000"/>
-          <w:sz w:val="20"/>
-          <w:szCs w:val="20"/>
+        </w:rPr>
+      </w:pPr>
+      <w:r>
+        <w:rPr>
+          <w:rFonts w:ascii="Metropolis" w:eastAsia="Metropolis" w:hAnsi="Metropolis" w:cs="Metropolis"/>
+          <w:color w:val="000000"/>
         </w:rPr>
         <w:t xml:space="preserve">Os membros da equipe estão descritos no </w:t>
       </w:r>
@@ -4105,8 +4105,6 @@
           <w:rFonts w:ascii="Metropolis" w:eastAsia="Metropolis" w:hAnsi="Metropolis" w:cs="Metropolis"/>
           <w:b/>
           <w:color w:val="000000"/>
-          <w:sz w:val="20"/>
-          <w:szCs w:val="20"/>
         </w:rPr>
         <w:t>Quadro 8-1</w:t>
       </w:r>
@@ -4114,8 +4112,6 @@
         <w:rPr>
           <w:rFonts w:ascii="Metropolis" w:eastAsia="Metropolis" w:hAnsi="Metropolis" w:cs="Metropolis"/>
           <w:color w:val="000000"/>
-          <w:sz w:val="20"/>
-          <w:szCs w:val="20"/>
         </w:rPr>
         <w:t xml:space="preserve">. </w:t>
       </w:r>
@@ -5468,6 +5464,236 @@
         </w:rPr>
         <w:t>Data do aceite da proposta: ______________________</w:t>
       </w:r>
+    </w:p>
+    <w:p>
+      <w:pPr>
+        <w:spacing w:after="0" w:line="360" w:lineRule="auto"/>
+        <w:jc w:val="both"/>
+        <w:rPr>
+          <w:rFonts w:ascii="Metropolis" w:eastAsia="Metropolis" w:hAnsi="Metropolis" w:cs="Metropolis"/>
+          <w:b/>
+        </w:rPr>
+      </w:pPr>
+      <w:r>
+        <w:rPr>
+          <w:rFonts w:ascii="Metropolis" w:eastAsia="Metropolis" w:hAnsi="Metropolis" w:cs="Metropolis"/>
+          <w:b/>
+        </w:rPr>
+        <w:t>_____________________________________</w:t>
+      </w:r>
+    </w:p>
+    <w:p>
+      <w:pPr>
+        <w:keepLines/>
+        <w:pBdr>
+          <w:top w:val="nil"/>
+          <w:left w:val="nil"/>
+          <w:bottom w:val="nil"/>
+          <w:right w:val="nil"/>
+          <w:between w:val="nil"/>
+        </w:pBdr>
+        <w:spacing w:after="0" w:line="360" w:lineRule="auto"/>
+        <w:ind w:right="1274"/>
+        <w:jc w:val="both"/>
+        <w:rPr>
+          <w:rFonts w:ascii="Metropolis" w:eastAsia="Metropolis" w:hAnsi="Metropolis" w:cs="Metropolis"/>
+          <w:b/>
+          <w:color w:val="000000"/>
+        </w:rPr>
+      </w:pPr>
+      <w:r>
+        <w:rPr>
+          <w:rFonts w:ascii="Metropolis" w:eastAsia="Metropolis" w:hAnsi="Metropolis" w:cs="Metropolis"/>
+          <w:b/>
+          <w:color w:val="000000"/>
+        </w:rPr>
+        <w:t>PAPYRUS CONSULTORIA AMBIENTAL LTDA</w:t>
+      </w:r>
+    </w:p>
+    <w:p>
+      <w:pPr>
+        <w:keepLines/>
+        <w:pBdr>
+          <w:top w:val="nil"/>
+          <w:left w:val="nil"/>
+          <w:bottom w:val="nil"/>
+          <w:right w:val="nil"/>
+          <w:between w:val="nil"/>
+        </w:pBdr>
+        <w:spacing w:after="0" w:line="360" w:lineRule="auto"/>
+        <w:ind w:right="4320"/>
+        <w:jc w:val="both"/>
+        <w:rPr>
+          <w:rFonts w:ascii="Metropolis" w:eastAsia="Metropolis" w:hAnsi="Metropolis" w:cs="Metropolis"/>
+          <w:b/>
+          <w:color w:val="000000"/>
+        </w:rPr>
+      </w:pPr>
+      <w:r>
+        <w:rPr>
+          <w:rFonts w:ascii="Metropolis" w:eastAsia="Metropolis" w:hAnsi="Metropolis" w:cs="Metropolis"/>
+          <w:b/>
+          <w:color w:val="000000"/>
+        </w:rPr>
+        <w:t>CNPJ: 07.946.358/0001-50</w:t>
+      </w:r>
+    </w:p>
+    <w:p>
+      <w:pPr>
+        <w:pBdr>
+          <w:top w:val="nil"/>
+          <w:left w:val="nil"/>
+          <w:bottom w:val="nil"/>
+          <w:right w:val="nil"/>
+          <w:between w:val="nil"/>
+        </w:pBdr>
+        <w:spacing w:after="0" w:line="360" w:lineRule="auto"/>
+        <w:rPr>
+          <w:rFonts w:ascii="Metropolis" w:eastAsia="Metropolis" w:hAnsi="Metropolis" w:cs="Metropolis"/>
+          <w:b/>
+          <w:i/>
+          <w:color w:val="000000"/>
+          <w:sz w:val="20"/>
+          <w:szCs w:val="20"/>
+        </w:rPr>
+      </w:pPr>
+    </w:p>
+    <w:p>
+      <w:pPr>
+        <w:pBdr>
+          <w:top w:val="nil"/>
+          <w:left w:val="nil"/>
+          <w:bottom w:val="nil"/>
+          <w:right w:val="nil"/>
+          <w:between w:val="nil"/>
+        </w:pBdr>
+        <w:spacing w:after="0" w:line="360" w:lineRule="auto"/>
+        <w:rPr>
+          <w:rFonts w:ascii="Metropolis" w:eastAsia="Metropolis" w:hAnsi="Metropolis" w:cs="Metropolis"/>
+          <w:color w:val="000000"/>
+          <w:sz w:val="20"/>
+          <w:szCs w:val="20"/>
+        </w:rPr>
+      </w:pPr>
+    </w:p>
+    <w:p>
+      <w:pPr>
+        <w:keepLines/>
+        <w:pBdr>
+          <w:top w:val="nil"/>
+          <w:left w:val="nil"/>
+          <w:bottom w:val="nil"/>
+          <w:right w:val="nil"/>
+          <w:between w:val="nil"/>
+        </w:pBdr>
+        <w:spacing w:after="0" w:line="360" w:lineRule="auto"/>
+        <w:ind w:right="1274"/>
+        <w:jc w:val="both"/>
+        <w:rPr>
+          <w:rFonts w:ascii="Metropolis" w:eastAsia="Metropolis" w:hAnsi="Metropolis" w:cs="Metropolis"/>
+          <w:b/>
+          <w:color w:val="000000"/>
+        </w:rPr>
+      </w:pPr>
+      <w:r>
+        <w:rPr>
+          <w:rFonts w:ascii="Metropolis" w:eastAsia="Metropolis" w:hAnsi="Metropolis" w:cs="Metropolis"/>
+          <w:b/>
+          <w:color w:val="000000"/>
+        </w:rPr>
+        <w:t>_____________________________________</w:t>
+      </w:r>
+    </w:p>
+    <w:p>
+      <w:pPr>
+        <w:keepLines/>
+        <w:pBdr>
+          <w:top w:val="nil"/>
+          <w:left w:val="nil"/>
+          <w:bottom w:val="nil"/>
+          <w:right w:val="nil"/>
+          <w:between w:val="nil"/>
+        </w:pBdr>
+        <w:tabs>
+          <w:tab w:val="left" w:pos="4111"/>
+        </w:tabs>
+        <w:spacing w:after="0" w:line="360" w:lineRule="auto"/>
+        <w:ind w:right="4320"/>
+        <w:jc w:val="both"/>
+        <w:rPr>
+          <w:rFonts w:ascii="Metropolis" w:eastAsia="Metropolis" w:hAnsi="Metropolis" w:cs="Metropolis"/>
+          <w:b/>
+          <w:color w:val="000000"/>
+        </w:rPr>
+      </w:pPr>
+      <w:r>
+        <w:rPr>
+          <w:rFonts w:ascii="Metropolis" w:eastAsia="Metropolis" w:hAnsi="Metropolis" w:cs="Metropolis"/>
+          <w:b/>
+          <w:color w:val="000000"/>
+        </w:rPr>
+        <w:t>{{NOME_CLIENTE_ASSINATURA}}</w:t>
+      </w:r>
+    </w:p>
+    <w:p>
+      <w:pPr>
+        <w:keepLines/>
+        <w:pBdr>
+          <w:top w:val="nil"/>
+          <w:left w:val="nil"/>
+          <w:bottom w:val="nil"/>
+          <w:right w:val="nil"/>
+          <w:between w:val="nil"/>
+        </w:pBdr>
+        <w:spacing w:after="0" w:line="360" w:lineRule="auto"/>
+        <w:ind w:right="4320"/>
+        <w:jc w:val="both"/>
+        <w:rPr>
+          <w:rFonts w:ascii="Metropolis" w:eastAsia="Metropolis" w:hAnsi="Metropolis" w:cs="Metropolis"/>
+          <w:b/>
+          <w:color w:val="000000"/>
+        </w:rPr>
+      </w:pPr>
+      <w:r>
+        <w:rPr>
+          <w:rFonts w:ascii="Metropolis" w:eastAsia="Metropolis" w:hAnsi="Metropolis" w:cs="Metropolis"/>
+          <w:b/>
+          <w:color w:val="000000"/>
+        </w:rPr>
+        <w:t>CNPJ: {{CNPJ_CLIENTE}}</w:t>
+      </w:r>
+      <w:r>
+        <w:rPr>
+          <w:rFonts w:ascii="Metropolis" w:eastAsia="Metropolis" w:hAnsi="Metropolis" w:cs="Metropolis"/>
+          <w:b/>
+          <w:color w:val="000000"/>
+        </w:rPr>
+        <w:tab/>
+      </w:r>
+    </w:p>
+    <w:p>
+      <w:pPr>
+        <w:spacing w:after="0" w:line="360" w:lineRule="auto"/>
+        <w:rPr>
+          <w:rFonts w:ascii="Metropolis" w:eastAsia="Metropolis" w:hAnsi="Metropolis" w:cs="Metropolis"/>
+        </w:rPr>
+      </w:pPr>
+    </w:p>
+    <w:p>
+      <w:pPr>
+        <w:spacing w:after="0" w:line="360" w:lineRule="auto"/>
+        <w:rPr>
+          <w:rFonts w:ascii="Metropolis" w:eastAsia="Metropolis" w:hAnsi="Metropolis" w:cs="Metropolis"/>
+        </w:rPr>
+      </w:pPr>
+    </w:p>
+    <w:p>
+      <w:pPr>
+        <w:spacing w:after="0" w:line="360" w:lineRule="auto"/>
+        <w:rPr>
+          <w:rFonts w:ascii="Metropolis" w:eastAsia="Metropolis" w:hAnsi="Metropolis" w:cs="Metropolis"/>
+        </w:rPr>
+      </w:pPr>
     </w:p>
     <w:p>
       <w:pPr>

</xml_diff>

<commit_message>
feat: adiciona exportação via MSPROJECT
</commit_message>
<xml_diff>
--- a/app/templates/docx/proposta_tecnica_comercial.docx
+++ b/app/templates/docx/proposta_tecnica_comercial.docx
@@ -7141,11 +7141,13 @@
     </w:p>
     <w:sectPr>
       <w:headerReference w:type="default" r:id="rId15"/>
+      <w:headerReference w:type="first" r:id="rId19"/>
       <w:footerReference w:type="default" r:id="rId16"/>
       <w:pgSz w:w="11906" w:h="16838"/>
       <w:pgMar w:top="1417" w:right="1701" w:bottom="1417" w:left="1701" w:header="708" w:footer="708" w:gutter="0"/>
       <w:pgNumType w:start="1"/>
       <w:cols w:space="720"/>
+      <w:titlePg/>
     </w:sectPr>
   </w:body>
 </w:document>
@@ -7678,6 +7680,87 @@
         </wp:anchor>
       </w:drawing>
     </w:r>
+  </w:p>
+  <w:p>
+    <w:pPr>
+      <w:pBdr>
+        <w:top w:val="nil"/>
+        <w:left w:val="nil"/>
+        <w:bottom w:val="nil"/>
+        <w:right w:val="nil"/>
+        <w:between w:val="nil"/>
+      </w:pBdr>
+      <w:tabs>
+        <w:tab w:val="center" w:pos="4252"/>
+        <w:tab w:val="right" w:pos="8504"/>
+      </w:tabs>
+      <w:spacing w:after="0" w:line="240" w:lineRule="auto"/>
+      <w:rPr>
+        <w:color w:val="000000"/>
+      </w:rPr>
+    </w:pPr>
+  </w:p>
+  <w:p>
+    <w:pPr>
+      <w:pBdr>
+        <w:top w:val="nil"/>
+        <w:left w:val="nil"/>
+        <w:bottom w:val="nil"/>
+        <w:right w:val="nil"/>
+        <w:between w:val="nil"/>
+      </w:pBdr>
+      <w:tabs>
+        <w:tab w:val="center" w:pos="4252"/>
+        <w:tab w:val="right" w:pos="8504"/>
+      </w:tabs>
+      <w:spacing w:after="0" w:line="240" w:lineRule="auto"/>
+      <w:rPr>
+        <w:color w:val="000000"/>
+      </w:rPr>
+    </w:pPr>
+  </w:p>
+  <w:p>
+    <w:pPr>
+      <w:pBdr>
+        <w:top w:val="nil"/>
+        <w:left w:val="nil"/>
+        <w:bottom w:val="nil"/>
+        <w:right w:val="nil"/>
+        <w:between w:val="nil"/>
+      </w:pBdr>
+      <w:tabs>
+        <w:tab w:val="center" w:pos="4252"/>
+        <w:tab w:val="right" w:pos="8504"/>
+      </w:tabs>
+      <w:spacing w:after="0" w:line="240" w:lineRule="auto"/>
+      <w:rPr>
+        <w:color w:val="000000"/>
+      </w:rPr>
+    </w:pPr>
+  </w:p>
+</w:hdr>
+</file>
+
+<file path=word/header2.xml><?xml version="1.0" encoding="utf-8"?>
+<w:hdr xmlns:wpc="http://schemas.microsoft.com/office/word/2010/wordprocessingCanvas" xmlns:cx="http://schemas.microsoft.com/office/drawing/2014/chartex" xmlns:cx1="http://schemas.microsoft.com/office/drawing/2015/9/8/chartex" xmlns:cx2="http://schemas.microsoft.com/office/drawing/2015/10/21/chartex" xmlns:cx3="http://schemas.microsoft.com/office/drawing/2016/5/9/chartex" xmlns:cx4="http://schemas.microsoft.com/office/drawing/2016/5/10/chartex" xmlns:cx5="http://schemas.microsoft.com/office/drawing/2016/5/11/chartex" xmlns:cx6="http://schemas.microsoft.com/office/drawing/2016/5/12/chartex" xmlns:cx7="http://schemas.microsoft.com/office/drawing/2016/5/13/chartex" xmlns:cx8="http://schemas.microsoft.com/office/drawing/2016/5/14/chartex" xmlns:mc="http://schemas.openxmlformats.org/markup-compatibility/2006" xmlns:aink="http://schemas.microsoft.com/office/drawing/2016/ink" xmlns:am3d="http://schemas.microsoft.com/office/drawing/2017/model3d" xmlns:o="urn:schemas-microsoft-com:office:office" xmlns:oel="http://schemas.microsoft.com/office/2019/extlst" xmlns:r="http://schemas.openxmlformats.org/officeDocument/2006/relationships" xmlns:m="http://schemas.openxmlformats.org/officeDocument/2006/math" xmlns:v="urn:schemas-microsoft-com:vml" xmlns:wp14="http://schemas.microsoft.com/office/word/2010/wordprocessingDrawing" xmlns:wp="http://schemas.openxmlformats.org/drawingml/2006/wordprocessingDrawing" xmlns:w10="urn:schemas-microsoft-com:office:word" xmlns:w="http://schemas.openxmlformats.org/wordprocessingml/2006/main" xmlns:w14="http://schemas.microsoft.com/office/word/2010/wordml" xmlns:w15="http://schemas.microsoft.com/office/word/2012/wordml" xmlns:w16cex="http://schemas.microsoft.com/office/word/2018/wordml/cex" xmlns:w16cid="http://schemas.microsoft.com/office/word/2016/wordml/cid" xmlns:w16="http://schemas.microsoft.com/office/word/2018/wordml" xmlns:w16du="http://schemas.microsoft.com/office/word/2023/wordml/word16du" xmlns:w16sdtdh="http://schemas.microsoft.com/office/word/2020/wordml/sdtdatahash" xmlns:w16sdtfl="http://schemas.microsoft.com/office/word/2024/wordml/sdtformatlock" xmlns:w16se="http://schemas.microsoft.com/office/word/2015/wordml/symex" xmlns:wpg="http://schemas.microsoft.com/office/word/2010/wordprocessingGroup" xmlns:wpi="http://schemas.microsoft.com/office/word/2010/wordprocessingInk" xmlns:wne="http://schemas.microsoft.com/office/word/2006/wordml" xmlns:wps="http://schemas.microsoft.com/office/word/2010/wordprocessingShape" mc:Ignorable="w14 w15 w16se w16cid w16 w16cex w16sdtdh w16sdtfl w16du wp14">
+  <w:p>
+    <w:pPr>
+      <w:pBdr>
+        <w:top w:val="nil"/>
+        <w:left w:val="nil"/>
+        <w:bottom w:val="nil"/>
+        <w:right w:val="nil"/>
+        <w:between w:val="nil"/>
+      </w:pBdr>
+      <w:tabs>
+        <w:tab w:val="center" w:pos="4252"/>
+        <w:tab w:val="right" w:pos="8504"/>
+      </w:tabs>
+      <w:spacing w:after="0" w:line="240" w:lineRule="auto"/>
+      <w:rPr>
+        <w:color w:val="000000"/>
+      </w:rPr>
+    </w:pPr>
   </w:p>
   <w:p>
     <w:pPr>

</xml_diff>

<commit_message>
fix: corrige função de bairro e nomenclatura da proposta
</commit_message>
<xml_diff>
--- a/app/templates/docx/proposta_tecnica_comercial.docx
+++ b/app/templates/docx/proposta_tecnica_comercial.docx
@@ -5464,6 +5464,26 @@
         </w:rPr>
         <w:t>Data do aceite da proposta: ______________________</w:t>
       </w:r>
+    </w:p>
+    <w:p>
+      <w:pPr>
+        <w:pBdr>
+          <w:top w:val="nil"/>
+          <w:left w:val="nil"/>
+          <w:bottom w:val="nil"/>
+          <w:right w:val="nil"/>
+          <w:between w:val="nil"/>
+        </w:pBdr>
+        <w:spacing w:after="0" w:line="360" w:lineRule="auto"/>
+        <w:rPr>
+          <w:rFonts w:ascii="Metropolis" w:eastAsia="Metropolis" w:hAnsi="Metropolis" w:cs="Metropolis"/>
+          <w:b/>
+          <w:i/>
+          <w:color w:val="000000"/>
+          <w:sz w:val="20"/>
+          <w:szCs w:val="20"/>
+        </w:rPr>
+      </w:pPr>
     </w:p>
     <w:p>
       <w:pPr>

</xml_diff>

<commit_message>
fix: corrige algumas inconsistencias no projeto
</commit_message>
<xml_diff>
--- a/app/templates/docx/proposta_tecnica_comercial.docx
+++ b/app/templates/docx/proposta_tecnica_comercial.docx
@@ -489,7 +489,7 @@
     <w:tbl>
       <w:tblPr>
         <w:tblStyle w:val="a"/>
-        <w:tblW w:w="9912" w:type="dxa"/>
+        <w:tblW w:w="8494" w:type="dxa"/>
         <w:jc w:val="center"/>
         <w:tblInd w:w="0" w:type="dxa"/>
         <w:tblBorders>
@@ -505,7 +505,7 @@
       </w:tblPr>
       <w:tblGrid>
         <w:gridCol w:w="1253"/>
-        <w:gridCol w:w="6868"/>
+        <w:gridCol w:w="5450"/>
         <w:gridCol w:w="1791"/>
       </w:tblGrid>
       <w:tr>
@@ -514,7 +514,7 @@
         </w:trPr>
         <w:tc>
           <w:tcPr>
-            <w:tcW w:w="9912" w:type="dxa"/>
+            <w:tcW w:w="8494" w:type="dxa"/>
             <w:gridSpan w:val="3"/>
             <w:tcBorders>
               <w:top w:val="single" w:sz="18" w:space="0" w:color="000000"/>
@@ -583,7 +583,7 @@
         </w:tc>
         <w:tc>
           <w:tcPr>
-            <w:tcW w:w="6868" w:type="dxa"/>
+            <w:tcW w:w="5450" w:type="dxa"/>
             <w:tcBorders>
               <w:top w:val="single" w:sz="18" w:space="0" w:color="000000"/>
             </w:tcBorders>
@@ -675,7 +675,7 @@
         </w:tc>
         <w:tc>
           <w:tcPr>
-            <w:tcW w:w="6868" w:type="dxa"/>
+            <w:tcW w:w="5450" w:type="dxa"/>
           </w:tcPr>
           <w:p>
             <w:pPr>
@@ -758,7 +758,7 @@
         </w:tc>
         <w:tc>
           <w:tcPr>
-            <w:tcW w:w="6868" w:type="dxa"/>
+            <w:tcW w:w="5450" w:type="dxa"/>
           </w:tcPr>
           <w:p>
             <w:pPr>
@@ -825,7 +825,7 @@
         </w:tc>
         <w:tc>
           <w:tcPr>
-            <w:tcW w:w="6868" w:type="dxa"/>
+            <w:tcW w:w="5450" w:type="dxa"/>
           </w:tcPr>
           <w:p>
             <w:pPr>
@@ -892,7 +892,7 @@
         </w:tc>
         <w:tc>
           <w:tcPr>
-            <w:tcW w:w="6868" w:type="dxa"/>
+            <w:tcW w:w="5450" w:type="dxa"/>
           </w:tcPr>
           <w:p>
             <w:pPr>
@@ -961,13 +961,11 @@
         </w:tc>
         <w:tc>
           <w:tcPr>
-            <w:tcW w:w="6868" w:type="dxa"/>
+            <w:tcW w:w="5450" w:type="dxa"/>
           </w:tcPr>
           <w:p>
             <w:pPr>
               <w:spacing w:after="0" w:line="360" w:lineRule="auto"/>
-              <w:ind w:left="-1094"/>
-              <w:jc w:val="right"/>
               <w:rPr>
                 <w:rFonts w:ascii="Metropolis" w:eastAsia="Metropolis" w:hAnsi="Metropolis" w:cs="Metropolis"/>
                 <w:sz w:val="20"/>
@@ -1030,13 +1028,11 @@
         </w:tc>
         <w:tc>
           <w:tcPr>
-            <w:tcW w:w="6868" w:type="dxa"/>
+            <w:tcW w:w="5450" w:type="dxa"/>
           </w:tcPr>
           <w:p>
             <w:pPr>
               <w:spacing w:after="0" w:line="360" w:lineRule="auto"/>
-              <w:ind w:left="-1094"/>
-              <w:jc w:val="right"/>
               <w:rPr>
                 <w:rFonts w:ascii="Metropolis" w:eastAsia="Metropolis" w:hAnsi="Metropolis" w:cs="Metropolis"/>
                 <w:sz w:val="20"/>
@@ -1099,13 +1095,11 @@
         </w:tc>
         <w:tc>
           <w:tcPr>
-            <w:tcW w:w="6868" w:type="dxa"/>
+            <w:tcW w:w="5450" w:type="dxa"/>
           </w:tcPr>
           <w:p>
             <w:pPr>
               <w:spacing w:after="0" w:line="360" w:lineRule="auto"/>
-              <w:ind w:left="-1094"/>
-              <w:jc w:val="right"/>
               <w:rPr>
                 <w:rFonts w:ascii="Metropolis" w:eastAsia="Metropolis" w:hAnsi="Metropolis" w:cs="Metropolis"/>
                 <w:sz w:val="20"/>
@@ -1168,13 +1162,11 @@
         </w:tc>
         <w:tc>
           <w:tcPr>
-            <w:tcW w:w="6868" w:type="dxa"/>
+            <w:tcW w:w="5450" w:type="dxa"/>
           </w:tcPr>
           <w:p>
             <w:pPr>
               <w:spacing w:after="0" w:line="360" w:lineRule="auto"/>
-              <w:ind w:left="-1094"/>
-              <w:jc w:val="right"/>
               <w:rPr>
                 <w:rFonts w:ascii="Metropolis" w:eastAsia="Metropolis" w:hAnsi="Metropolis" w:cs="Metropolis"/>
                 <w:sz w:val="20"/>
@@ -1237,13 +1229,11 @@
         </w:tc>
         <w:tc>
           <w:tcPr>
-            <w:tcW w:w="6868" w:type="dxa"/>
+            <w:tcW w:w="5450" w:type="dxa"/>
           </w:tcPr>
           <w:p>
             <w:pPr>
               <w:spacing w:after="0" w:line="360" w:lineRule="auto"/>
-              <w:ind w:left="-1094"/>
-              <w:jc w:val="right"/>
               <w:rPr>
                 <w:rFonts w:ascii="Metropolis" w:eastAsia="Metropolis" w:hAnsi="Metropolis" w:cs="Metropolis"/>
                 <w:sz w:val="20"/>
@@ -1306,13 +1296,11 @@
         </w:tc>
         <w:tc>
           <w:tcPr>
-            <w:tcW w:w="6868" w:type="dxa"/>
+            <w:tcW w:w="5450" w:type="dxa"/>
           </w:tcPr>
           <w:p>
             <w:pPr>
               <w:spacing w:after="0" w:line="360" w:lineRule="auto"/>
-              <w:ind w:left="-1094"/>
-              <w:jc w:val="right"/>
               <w:rPr>
                 <w:rFonts w:ascii="Metropolis" w:eastAsia="Metropolis" w:hAnsi="Metropolis" w:cs="Metropolis"/>
                 <w:sz w:val="20"/>
@@ -1376,7 +1364,7 @@
         </w:tc>
         <w:tc>
           <w:tcPr>
-            <w:tcW w:w="6868" w:type="dxa"/>
+            <w:tcW w:w="5450" w:type="dxa"/>
             <w:tcBorders>
               <w:bottom w:val="single" w:sz="18" w:space="0" w:color="000000"/>
             </w:tcBorders>
@@ -1384,8 +1372,6 @@
           <w:p>
             <w:pPr>
               <w:spacing w:after="0" w:line="360" w:lineRule="auto"/>
-              <w:ind w:left="-1094"/>
-              <w:jc w:val="right"/>
               <w:rPr>
                 <w:rFonts w:ascii="Metropolis" w:eastAsia="Metropolis" w:hAnsi="Metropolis" w:cs="Metropolis"/>
                 <w:sz w:val="20"/>
@@ -1773,7 +1759,7 @@
           <w:i/>
           <w:u w:val="single"/>
         </w:rPr>
-        <w:t>Ref.: Proposta de serviço para {{DESCRICAO_SERVICO}}, nos municípios de {{MUNICIPIOS}}, estado {{ESTADO}}.</w:t>
+        <w:t>Ref.: {{REF_LINHA}}</w:t>
       </w:r>
     </w:p>
     <w:p>
@@ -2519,7 +2505,7 @@
           <w:rFonts w:ascii="Metropolis" w:eastAsia="Metropolis" w:hAnsi="Metropolis" w:cs="Metropolis"/>
           <w:color w:val="000000"/>
         </w:rPr>
-        <w:t>(71) 99320-0222</w:t>
+        <w:t>(11) 96404-6683</w:t>
       </w:r>
     </w:p>
     <w:p>
@@ -3449,7 +3435,20 @@
           <w:rFonts w:ascii="Metropolis" w:eastAsia="Metropolis" w:hAnsi="Metropolis" w:cs="Metropolis"/>
         </w:rPr>
         <w:lastRenderedPageBreak/>
-        <w:t>Assumir a responsabilidade por quaisquer ajustes/complementações dos relatórios elaborados pela CONTRATADA encaminhados para análise junto ao órgão ambiental.</w:t>
+        <w:t xml:space="preserve">Assumir a responsabilidade por quaisquer ajustes/complementações dos relatórios elaborados pela </w:t>
+      </w:r>
+      <w:r>
+        <w:rPr>
+          <w:rFonts w:ascii="Metropolis" w:eastAsia="Metropolis" w:hAnsi="Metropolis" w:cs="Metropolis"/>
+          <w:b/>
+        </w:rPr>
+        <w:t>PAPYRUS</w:t>
+      </w:r>
+      <w:r>
+        <w:rPr>
+          <w:rFonts w:ascii="Metropolis" w:eastAsia="Metropolis" w:hAnsi="Metropolis" w:cs="Metropolis"/>
+        </w:rPr>
+        <w:t xml:space="preserve"> encaminhados para análise junto ao órgão ambiental.</w:t>
       </w:r>
     </w:p>
     <w:p>
@@ -4343,7 +4342,6 @@
         <w:tc>
           <w:tcPr>
             <w:tcW w:w="2177" w:type="dxa"/>
-            <w:vMerge w:val="restart"/>
             <w:vAlign w:val="center"/>
           </w:tcPr>
           <w:p>
@@ -4371,7 +4369,7 @@
                 <w:sz w:val="20"/>
                 <w:szCs w:val="20"/>
               </w:rPr>
-              <w:t>Diretoria</w:t>
+              <w:t/>
             </w:r>
           </w:p>
         </w:tc>
@@ -4405,7 +4403,7 @@
                 <w:sz w:val="20"/>
                 <w:szCs w:val="20"/>
               </w:rPr>
-              <w:t>Diretora de Negócios</w:t>
+              <w:t/>
             </w:r>
           </w:p>
         </w:tc>
@@ -4439,7 +4437,7 @@
                 <w:sz w:val="20"/>
                 <w:szCs w:val="20"/>
               </w:rPr>
-              <w:t>Charlene Luz</w:t>
+              <w:t/>
             </w:r>
           </w:p>
         </w:tc>
@@ -4473,753 +4471,7 @@
                 <w:sz w:val="20"/>
                 <w:szCs w:val="20"/>
               </w:rPr>
-              <w:t>Doutora em Gestão Ambiental. Mestre em Engenharia Ambiental Urbana. Pós-Graduada em Engenharia de Segurança do Trabalho. MBA em Auditoria e Gestão Ambiental. Engenheira de Produção Mecânica. Bacharel em Urbanismo. Técnica em Meio Ambiente.</w:t>
-            </w:r>
-          </w:p>
-          <w:p>
-            <w:pPr>
-              <w:pBdr>
-                <w:top w:val="nil"/>
-                <w:left w:val="nil"/>
-                <w:bottom w:val="nil"/>
-                <w:right w:val="nil"/>
-                <w:between w:val="nil"/>
-              </w:pBdr>
-              <w:spacing w:after="0" w:line="240" w:lineRule="auto"/>
-              <w:jc w:val="center"/>
-              <w:rPr>
-                <w:rFonts w:ascii="Metropolis" w:eastAsia="Metropolis" w:hAnsi="Metropolis" w:cs="Metropolis"/>
-                <w:color w:val="000000"/>
-                <w:sz w:val="20"/>
-                <w:szCs w:val="20"/>
-              </w:rPr>
-            </w:pPr>
-            <w:r>
-              <w:rPr>
-                <w:rFonts w:ascii="Metropolis" w:eastAsia="Metropolis" w:hAnsi="Metropolis" w:cs="Metropolis"/>
-                <w:color w:val="000000"/>
-                <w:sz w:val="20"/>
-                <w:szCs w:val="20"/>
-              </w:rPr>
-              <w:t>CREA: 46778.</w:t>
-            </w:r>
-          </w:p>
-        </w:tc>
-      </w:tr>
-      <w:tr>
-        <w:trPr>
-          <w:jc w:val="center"/>
-        </w:trPr>
-        <w:tc>
-          <w:tcPr>
-            <w:tcW w:w="2177" w:type="dxa"/>
-            <w:vMerge/>
-            <w:vAlign w:val="center"/>
-          </w:tcPr>
-          <w:p>
-            <w:pPr>
-              <w:widowControl w:val="0"/>
-              <w:pBdr>
-                <w:top w:val="nil"/>
-                <w:left w:val="nil"/>
-                <w:bottom w:val="nil"/>
-                <w:right w:val="nil"/>
-                <w:between w:val="nil"/>
-              </w:pBdr>
-              <w:spacing w:after="0" w:line="276" w:lineRule="auto"/>
-              <w:rPr>
-                <w:rFonts w:ascii="Metropolis" w:eastAsia="Metropolis" w:hAnsi="Metropolis" w:cs="Metropolis"/>
-                <w:color w:val="000000"/>
-                <w:sz w:val="20"/>
-                <w:szCs w:val="20"/>
-              </w:rPr>
-            </w:pPr>
-          </w:p>
-        </w:tc>
-        <w:tc>
-          <w:tcPr>
-            <w:tcW w:w="1643" w:type="dxa"/>
-            <w:vAlign w:val="center"/>
-          </w:tcPr>
-          <w:p>
-            <w:pPr>
-              <w:pBdr>
-                <w:top w:val="nil"/>
-                <w:left w:val="nil"/>
-                <w:bottom w:val="nil"/>
-                <w:right w:val="nil"/>
-                <w:between w:val="nil"/>
-              </w:pBdr>
-              <w:spacing w:after="0" w:line="240" w:lineRule="auto"/>
-              <w:jc w:val="center"/>
-              <w:rPr>
-                <w:rFonts w:ascii="Metropolis" w:eastAsia="Metropolis" w:hAnsi="Metropolis" w:cs="Metropolis"/>
-                <w:color w:val="000000"/>
-                <w:sz w:val="20"/>
-                <w:szCs w:val="20"/>
-              </w:rPr>
-            </w:pPr>
-            <w:r>
-              <w:rPr>
-                <w:rFonts w:ascii="Metropolis" w:eastAsia="Metropolis" w:hAnsi="Metropolis" w:cs="Metropolis"/>
-                <w:color w:val="000000"/>
-                <w:sz w:val="20"/>
-                <w:szCs w:val="20"/>
-              </w:rPr>
-              <w:t>Diretor Técnico</w:t>
-            </w:r>
-          </w:p>
-        </w:tc>
-        <w:tc>
-          <w:tcPr>
-            <w:tcW w:w="1725" w:type="dxa"/>
-            <w:vAlign w:val="center"/>
-          </w:tcPr>
-          <w:p>
-            <w:pPr>
-              <w:pBdr>
-                <w:top w:val="nil"/>
-                <w:left w:val="nil"/>
-                <w:bottom w:val="nil"/>
-                <w:right w:val="nil"/>
-                <w:between w:val="nil"/>
-              </w:pBdr>
-              <w:spacing w:after="0" w:line="240" w:lineRule="auto"/>
-              <w:jc w:val="center"/>
-              <w:rPr>
-                <w:rFonts w:ascii="Metropolis" w:eastAsia="Metropolis" w:hAnsi="Metropolis" w:cs="Metropolis"/>
-                <w:color w:val="000000"/>
-                <w:sz w:val="20"/>
-                <w:szCs w:val="20"/>
-              </w:rPr>
-            </w:pPr>
-            <w:r>
-              <w:rPr>
-                <w:rFonts w:ascii="Metropolis" w:eastAsia="Metropolis" w:hAnsi="Metropolis" w:cs="Metropolis"/>
-                <w:color w:val="000000"/>
-                <w:sz w:val="20"/>
-                <w:szCs w:val="20"/>
-              </w:rPr>
-              <w:t>Ricardo Hortélio</w:t>
-            </w:r>
-          </w:p>
-        </w:tc>
-        <w:tc>
-          <w:tcPr>
-            <w:tcW w:w="2949" w:type="dxa"/>
-            <w:vAlign w:val="center"/>
-          </w:tcPr>
-          <w:p>
-            <w:pPr>
-              <w:pBdr>
-                <w:top w:val="nil"/>
-                <w:left w:val="nil"/>
-                <w:bottom w:val="nil"/>
-                <w:right w:val="nil"/>
-                <w:between w:val="nil"/>
-              </w:pBdr>
-              <w:spacing w:after="0" w:line="240" w:lineRule="auto"/>
-              <w:jc w:val="center"/>
-              <w:rPr>
-                <w:rFonts w:ascii="Metropolis" w:eastAsia="Metropolis" w:hAnsi="Metropolis" w:cs="Metropolis"/>
-                <w:color w:val="000000"/>
-                <w:sz w:val="20"/>
-                <w:szCs w:val="20"/>
-              </w:rPr>
-            </w:pPr>
-            <w:r>
-              <w:rPr>
-                <w:rFonts w:ascii="Metropolis" w:eastAsia="Metropolis" w:hAnsi="Metropolis" w:cs="Metropolis"/>
-                <w:color w:val="000000"/>
-                <w:sz w:val="20"/>
-                <w:szCs w:val="20"/>
-              </w:rPr>
-              <w:t>MBA em Auditoria e Gestão Ambiental. Biólogo Sênior. Perito Ambiental.</w:t>
-            </w:r>
-          </w:p>
-          <w:p>
-            <w:pPr>
-              <w:pBdr>
-                <w:top w:val="nil"/>
-                <w:left w:val="nil"/>
-                <w:bottom w:val="nil"/>
-                <w:right w:val="nil"/>
-                <w:between w:val="nil"/>
-              </w:pBdr>
-              <w:spacing w:after="0" w:line="240" w:lineRule="auto"/>
-              <w:jc w:val="center"/>
-              <w:rPr>
-                <w:rFonts w:ascii="Metropolis" w:eastAsia="Metropolis" w:hAnsi="Metropolis" w:cs="Metropolis"/>
-                <w:color w:val="000000"/>
-                <w:sz w:val="20"/>
-                <w:szCs w:val="20"/>
-              </w:rPr>
-            </w:pPr>
-            <w:r>
-              <w:rPr>
-                <w:rFonts w:ascii="Metropolis" w:eastAsia="Metropolis" w:hAnsi="Metropolis" w:cs="Metropolis"/>
-                <w:color w:val="000000"/>
-                <w:sz w:val="20"/>
-                <w:szCs w:val="20"/>
-              </w:rPr>
-              <w:t>CRBio: 46177/5-D.</w:t>
-            </w:r>
-          </w:p>
-        </w:tc>
-      </w:tr>
-      <w:tr>
-        <w:trPr>
-          <w:jc w:val="center"/>
-        </w:trPr>
-        <w:tc>
-          <w:tcPr>
-            <w:tcW w:w="2177" w:type="dxa"/>
-            <w:vMerge w:val="restart"/>
-            <w:vAlign w:val="center"/>
-          </w:tcPr>
-          <w:p>
-            <w:pPr>
-              <w:pBdr>
-                <w:top w:val="nil"/>
-                <w:left w:val="nil"/>
-                <w:bottom w:val="nil"/>
-                <w:right w:val="nil"/>
-                <w:between w:val="nil"/>
-              </w:pBdr>
-              <w:spacing w:after="0" w:line="240" w:lineRule="auto"/>
-              <w:jc w:val="center"/>
-              <w:rPr>
-                <w:rFonts w:ascii="Metropolis" w:eastAsia="Metropolis" w:hAnsi="Metropolis" w:cs="Metropolis"/>
-                <w:color w:val="000000"/>
-                <w:sz w:val="20"/>
-                <w:szCs w:val="20"/>
-              </w:rPr>
-            </w:pPr>
-            <w:r>
-              <w:rPr>
-                <w:rFonts w:ascii="Metropolis" w:eastAsia="Metropolis" w:hAnsi="Metropolis" w:cs="Metropolis"/>
-                <w:color w:val="000000"/>
-                <w:sz w:val="20"/>
-                <w:szCs w:val="20"/>
-              </w:rPr>
-              <w:t>Gestão</w:t>
-            </w:r>
-          </w:p>
-        </w:tc>
-        <w:tc>
-          <w:tcPr>
-            <w:tcW w:w="1643" w:type="dxa"/>
-            <w:vAlign w:val="center"/>
-          </w:tcPr>
-          <w:p>
-            <w:pPr>
-              <w:pBdr>
-                <w:top w:val="nil"/>
-                <w:left w:val="nil"/>
-                <w:bottom w:val="nil"/>
-                <w:right w:val="nil"/>
-                <w:between w:val="nil"/>
-              </w:pBdr>
-              <w:spacing w:after="0" w:line="240" w:lineRule="auto"/>
-              <w:jc w:val="center"/>
-              <w:rPr>
-                <w:rFonts w:ascii="Metropolis" w:eastAsia="Metropolis" w:hAnsi="Metropolis" w:cs="Metropolis"/>
-                <w:color w:val="000000"/>
-                <w:sz w:val="20"/>
-                <w:szCs w:val="20"/>
-              </w:rPr>
-            </w:pPr>
-            <w:r>
-              <w:rPr>
-                <w:rFonts w:ascii="Metropolis" w:eastAsia="Metropolis" w:hAnsi="Metropolis" w:cs="Metropolis"/>
-                <w:color w:val="000000"/>
-                <w:sz w:val="20"/>
-                <w:szCs w:val="20"/>
-              </w:rPr>
-              <w:t>Coordenação de Projetos</w:t>
-            </w:r>
-          </w:p>
-        </w:tc>
-        <w:tc>
-          <w:tcPr>
-            <w:tcW w:w="1725" w:type="dxa"/>
-            <w:vAlign w:val="center"/>
-          </w:tcPr>
-          <w:p>
-            <w:pPr>
-              <w:spacing w:after="0" w:line="240" w:lineRule="auto"/>
-              <w:jc w:val="center"/>
-              <w:rPr>
-                <w:rFonts w:ascii="Metropolis" w:eastAsia="Metropolis" w:hAnsi="Metropolis" w:cs="Metropolis"/>
-                <w:color w:val="000000"/>
-                <w:sz w:val="20"/>
-                <w:szCs w:val="20"/>
-              </w:rPr>
-            </w:pPr>
-            <w:r>
-              <w:rPr>
-                <w:rFonts w:ascii="Metropolis" w:eastAsia="Metropolis" w:hAnsi="Metropolis" w:cs="Metropolis"/>
-                <w:color w:val="000000"/>
-                <w:sz w:val="20"/>
-                <w:szCs w:val="20"/>
-              </w:rPr>
-              <w:t>Pedro Skinner</w:t>
-            </w:r>
-          </w:p>
-          <w:p>
-            <w:pPr>
-              <w:pBdr>
-                <w:top w:val="nil"/>
-                <w:left w:val="nil"/>
-                <w:bottom w:val="nil"/>
-                <w:right w:val="nil"/>
-                <w:between w:val="nil"/>
-              </w:pBdr>
-              <w:spacing w:after="0" w:line="240" w:lineRule="auto"/>
-              <w:jc w:val="center"/>
-              <w:rPr>
-                <w:rFonts w:ascii="Metropolis" w:eastAsia="Metropolis" w:hAnsi="Metropolis" w:cs="Metropolis"/>
-                <w:color w:val="000000"/>
-                <w:sz w:val="20"/>
-                <w:szCs w:val="20"/>
-              </w:rPr>
-            </w:pPr>
-          </w:p>
-        </w:tc>
-        <w:tc>
-          <w:tcPr>
-            <w:tcW w:w="2949" w:type="dxa"/>
-            <w:vAlign w:val="center"/>
-          </w:tcPr>
-          <w:p>
-            <w:pPr>
-              <w:pBdr>
-                <w:top w:val="nil"/>
-                <w:left w:val="nil"/>
-                <w:bottom w:val="nil"/>
-                <w:right w:val="nil"/>
-                <w:between w:val="nil"/>
-              </w:pBdr>
-              <w:spacing w:after="0" w:line="240" w:lineRule="auto"/>
-              <w:jc w:val="center"/>
-              <w:rPr>
-                <w:rFonts w:ascii="Metropolis" w:eastAsia="Metropolis" w:hAnsi="Metropolis" w:cs="Metropolis"/>
-                <w:color w:val="000000"/>
-                <w:sz w:val="20"/>
-                <w:szCs w:val="20"/>
-              </w:rPr>
-            </w:pPr>
-            <w:r>
-              <w:rPr>
-                <w:rFonts w:ascii="Metropolis" w:hAnsi="Metropolis" w:cs="Arial"/>
-                <w:bCs/>
-                <w:sz w:val="20"/>
-                <w:szCs w:val="20"/>
-                <w:lang w:eastAsia="en-US"/>
-              </w:rPr>
-              <w:t>Doutor e Mestre em Antropologia. Antropólogo</w:t>
-            </w:r>
-          </w:p>
-        </w:tc>
-      </w:tr>
-      <w:tr>
-        <w:trPr>
-          <w:trHeight w:val="647"/>
-          <w:jc w:val="center"/>
-        </w:trPr>
-        <w:tc>
-          <w:tcPr>
-            <w:tcW w:w="2177" w:type="dxa"/>
-            <w:vMerge/>
-            <w:vAlign w:val="center"/>
-          </w:tcPr>
-          <w:p>
-            <w:pPr>
-              <w:widowControl w:val="0"/>
-              <w:pBdr>
-                <w:top w:val="nil"/>
-                <w:left w:val="nil"/>
-                <w:bottom w:val="nil"/>
-                <w:right w:val="nil"/>
-                <w:between w:val="nil"/>
-              </w:pBdr>
-              <w:spacing w:after="0" w:line="276" w:lineRule="auto"/>
-              <w:rPr>
-                <w:rFonts w:ascii="Metropolis" w:eastAsia="Metropolis" w:hAnsi="Metropolis" w:cs="Metropolis"/>
-                <w:color w:val="000000"/>
-                <w:sz w:val="20"/>
-                <w:szCs w:val="20"/>
-              </w:rPr>
-            </w:pPr>
-          </w:p>
-        </w:tc>
-        <w:tc>
-          <w:tcPr>
-            <w:tcW w:w="1643" w:type="dxa"/>
-            <w:vAlign w:val="center"/>
-          </w:tcPr>
-          <w:p>
-            <w:pPr>
-              <w:pBdr>
-                <w:top w:val="nil"/>
-                <w:left w:val="nil"/>
-                <w:bottom w:val="nil"/>
-                <w:right w:val="nil"/>
-                <w:between w:val="nil"/>
-              </w:pBdr>
-              <w:spacing w:after="0" w:line="240" w:lineRule="auto"/>
-              <w:jc w:val="center"/>
-              <w:rPr>
-                <w:rFonts w:ascii="Metropolis" w:eastAsia="Metropolis" w:hAnsi="Metropolis" w:cs="Metropolis"/>
-                <w:color w:val="000000"/>
-                <w:sz w:val="20"/>
-                <w:szCs w:val="20"/>
-              </w:rPr>
-            </w:pPr>
-            <w:r>
-              <w:rPr>
-                <w:rFonts w:ascii="Metropolis" w:eastAsia="Metropolis" w:hAnsi="Metropolis" w:cs="Metropolis"/>
-                <w:color w:val="000000"/>
-                <w:sz w:val="20"/>
-                <w:szCs w:val="20"/>
-              </w:rPr>
-              <w:t>Segurança do Trabalho</w:t>
-            </w:r>
-          </w:p>
-        </w:tc>
-        <w:tc>
-          <w:tcPr>
-            <w:tcW w:w="1725" w:type="dxa"/>
-            <w:vAlign w:val="center"/>
-          </w:tcPr>
-          <w:p>
-            <w:pPr>
-              <w:pBdr>
-                <w:top w:val="nil"/>
-                <w:left w:val="nil"/>
-                <w:bottom w:val="nil"/>
-                <w:right w:val="nil"/>
-                <w:between w:val="nil"/>
-              </w:pBdr>
-              <w:spacing w:after="0" w:line="240" w:lineRule="auto"/>
-              <w:jc w:val="center"/>
-              <w:rPr>
-                <w:rFonts w:ascii="Metropolis" w:eastAsia="Metropolis" w:hAnsi="Metropolis" w:cs="Metropolis"/>
-                <w:color w:val="000000"/>
-                <w:sz w:val="20"/>
-                <w:szCs w:val="20"/>
-              </w:rPr>
-            </w:pPr>
-            <w:r>
-              <w:rPr>
-                <w:rFonts w:ascii="Metropolis" w:eastAsia="Metropolis" w:hAnsi="Metropolis" w:cs="Metropolis"/>
-                <w:color w:val="000000"/>
-                <w:sz w:val="20"/>
-                <w:szCs w:val="20"/>
-              </w:rPr>
-              <w:t>{{EQUIPE_SEG_TRABALHO_NOME}}</w:t>
-            </w:r>
-          </w:p>
-        </w:tc>
-        <w:tc>
-          <w:tcPr>
-            <w:tcW w:w="2949" w:type="dxa"/>
-            <w:vAlign w:val="center"/>
-          </w:tcPr>
-          <w:p>
-            <w:pPr>
-              <w:pBdr>
-                <w:top w:val="nil"/>
-                <w:left w:val="nil"/>
-                <w:bottom w:val="nil"/>
-                <w:right w:val="nil"/>
-                <w:between w:val="nil"/>
-              </w:pBdr>
-              <w:spacing w:after="0" w:line="240" w:lineRule="auto"/>
-              <w:jc w:val="center"/>
-              <w:rPr>
-                <w:rFonts w:ascii="Metropolis" w:eastAsia="Metropolis" w:hAnsi="Metropolis" w:cs="Metropolis"/>
-                <w:color w:val="000000"/>
-                <w:sz w:val="20"/>
-                <w:szCs w:val="20"/>
-              </w:rPr>
-            </w:pPr>
-            <w:r>
-              <w:rPr>
-                <w:rFonts w:ascii="Metropolis" w:eastAsia="Metropolis" w:hAnsi="Metropolis" w:cs="Metropolis"/>
-                <w:color w:val="000000"/>
-                <w:sz w:val="20"/>
-                <w:szCs w:val="20"/>
-              </w:rPr>
-              <w:t>{{EQUIPE_SEG_TRABALHO_QUALIFICACAO}}</w:t>
-            </w:r>
-          </w:p>
-        </w:tc>
-      </w:tr>
-      <w:tr>
-        <w:trPr>
-          <w:trHeight w:val="647"/>
-          <w:jc w:val="center"/>
-        </w:trPr>
-        <w:tc>
-          <w:tcPr>
-            <w:tcW w:w="2177" w:type="dxa"/>
-            <w:vMerge/>
-            <w:vAlign w:val="center"/>
-          </w:tcPr>
-          <w:p>
-            <w:pPr>
-              <w:widowControl w:val="0"/>
-              <w:pBdr>
-                <w:top w:val="nil"/>
-                <w:left w:val="nil"/>
-                <w:bottom w:val="nil"/>
-                <w:right w:val="nil"/>
-                <w:between w:val="nil"/>
-              </w:pBdr>
-              <w:spacing w:after="0" w:line="276" w:lineRule="auto"/>
-              <w:rPr>
-                <w:rFonts w:ascii="Metropolis" w:eastAsia="Metropolis" w:hAnsi="Metropolis" w:cs="Metropolis"/>
-                <w:color w:val="000000"/>
-                <w:sz w:val="20"/>
-                <w:szCs w:val="20"/>
-              </w:rPr>
-            </w:pPr>
-          </w:p>
-        </w:tc>
-        <w:tc>
-          <w:tcPr>
-            <w:tcW w:w="1643" w:type="dxa"/>
-            <w:vAlign w:val="center"/>
-          </w:tcPr>
-          <w:p>
-            <w:pPr>
-              <w:pBdr>
-                <w:top w:val="nil"/>
-                <w:left w:val="nil"/>
-                <w:bottom w:val="nil"/>
-                <w:right w:val="nil"/>
-                <w:between w:val="nil"/>
-              </w:pBdr>
-              <w:spacing w:after="0" w:line="240" w:lineRule="auto"/>
-              <w:jc w:val="center"/>
-              <w:rPr>
-                <w:rFonts w:ascii="Metropolis" w:eastAsia="Metropolis" w:hAnsi="Metropolis" w:cs="Metropolis"/>
-                <w:color w:val="000000"/>
-                <w:sz w:val="20"/>
-                <w:szCs w:val="20"/>
-              </w:rPr>
-            </w:pPr>
-            <w:r>
-              <w:rPr>
-                <w:rFonts w:ascii="Metropolis" w:eastAsia="Metropolis" w:hAnsi="Metropolis" w:cs="Metropolis"/>
-                <w:color w:val="000000"/>
-                <w:sz w:val="20"/>
-                <w:szCs w:val="20"/>
-              </w:rPr>
-              <w:t>Assessoria Ambiental Estratégica</w:t>
-            </w:r>
-          </w:p>
-        </w:tc>
-        <w:tc>
-          <w:tcPr>
-            <w:tcW w:w="1725" w:type="dxa"/>
-            <w:vAlign w:val="center"/>
-          </w:tcPr>
-          <w:p>
-            <w:pPr>
-              <w:pBdr>
-                <w:top w:val="nil"/>
-                <w:left w:val="nil"/>
-                <w:bottom w:val="nil"/>
-                <w:right w:val="nil"/>
-                <w:between w:val="nil"/>
-              </w:pBdr>
-              <w:spacing w:after="0" w:line="240" w:lineRule="auto"/>
-              <w:jc w:val="center"/>
-              <w:rPr>
-                <w:rFonts w:ascii="Metropolis" w:eastAsia="Metropolis" w:hAnsi="Metropolis" w:cs="Metropolis"/>
-                <w:color w:val="000000"/>
-                <w:sz w:val="20"/>
-                <w:szCs w:val="20"/>
-              </w:rPr>
-            </w:pPr>
-            <w:r>
-              <w:rPr>
-                <w:rFonts w:ascii="Metropolis" w:eastAsia="Metropolis" w:hAnsi="Metropolis" w:cs="Metropolis"/>
-                <w:color w:val="000000"/>
-                <w:sz w:val="20"/>
-                <w:szCs w:val="20"/>
-              </w:rPr>
-              <w:t>Antônio Molina</w:t>
-            </w:r>
-          </w:p>
-        </w:tc>
-        <w:tc>
-          <w:tcPr>
-            <w:tcW w:w="2949" w:type="dxa"/>
-            <w:vAlign w:val="center"/>
-          </w:tcPr>
-          <w:p>
-            <w:pPr>
-              <w:pBdr>
-                <w:top w:val="nil"/>
-                <w:left w:val="nil"/>
-                <w:bottom w:val="nil"/>
-                <w:right w:val="nil"/>
-                <w:between w:val="nil"/>
-              </w:pBdr>
-              <w:spacing w:after="0" w:line="240" w:lineRule="auto"/>
-              <w:jc w:val="center"/>
-              <w:rPr>
-                <w:rFonts w:ascii="Metropolis" w:eastAsia="Metropolis" w:hAnsi="Metropolis" w:cs="Metropolis"/>
-                <w:color w:val="000000"/>
-                <w:sz w:val="20"/>
-                <w:szCs w:val="20"/>
-              </w:rPr>
-            </w:pPr>
-            <w:r>
-              <w:rPr>
-                <w:rFonts w:ascii="Metropolis" w:eastAsia="Metropolis" w:hAnsi="Metropolis" w:cs="Metropolis"/>
-                <w:color w:val="000000"/>
-                <w:sz w:val="20"/>
-                <w:szCs w:val="20"/>
-              </w:rPr>
-              <w:t>Assessor Ambiental Sênior</w:t>
-            </w:r>
-          </w:p>
-        </w:tc>
-      </w:tr>
-      <w:tr>
-        <w:trPr>
-          <w:trHeight w:val="647"/>
-          <w:jc w:val="center"/>
-        </w:trPr>
-        <w:tc>
-          <w:tcPr>
-            <w:tcW w:w="2177" w:type="dxa"/>
-            <w:vMerge/>
-            <w:vAlign w:val="center"/>
-          </w:tcPr>
-          <w:p>
-            <w:pPr>
-              <w:widowControl w:val="0"/>
-              <w:pBdr>
-                <w:top w:val="nil"/>
-                <w:left w:val="nil"/>
-                <w:bottom w:val="nil"/>
-                <w:right w:val="nil"/>
-                <w:between w:val="nil"/>
-              </w:pBdr>
-              <w:spacing w:after="0" w:line="276" w:lineRule="auto"/>
-              <w:rPr>
-                <w:rFonts w:ascii="Metropolis" w:eastAsia="Metropolis" w:hAnsi="Metropolis" w:cs="Metropolis"/>
-                <w:color w:val="000000"/>
-                <w:sz w:val="20"/>
-                <w:szCs w:val="20"/>
-              </w:rPr>
-            </w:pPr>
-          </w:p>
-        </w:tc>
-        <w:tc>
-          <w:tcPr>
-            <w:tcW w:w="1643" w:type="dxa"/>
-            <w:vAlign w:val="center"/>
-          </w:tcPr>
-          <w:p>
-            <w:pPr>
-              <w:pBdr>
-                <w:top w:val="nil"/>
-                <w:left w:val="nil"/>
-                <w:bottom w:val="nil"/>
-                <w:right w:val="nil"/>
-                <w:between w:val="nil"/>
-              </w:pBdr>
-              <w:spacing w:after="0" w:line="240" w:lineRule="auto"/>
-              <w:jc w:val="center"/>
-              <w:rPr>
-                <w:rFonts w:ascii="Metropolis" w:eastAsia="Metropolis" w:hAnsi="Metropolis" w:cs="Metropolis"/>
-                <w:color w:val="000000"/>
-                <w:sz w:val="20"/>
-                <w:szCs w:val="20"/>
-              </w:rPr>
-            </w:pPr>
-            <w:r>
-              <w:rPr>
-                <w:rFonts w:ascii="Metropolis" w:eastAsia="Metropolis" w:hAnsi="Metropolis" w:cs="Metropolis"/>
-                <w:color w:val="000000"/>
-                <w:sz w:val="20"/>
-                <w:szCs w:val="20"/>
-              </w:rPr>
-              <w:t>Líder do Projeto</w:t>
-            </w:r>
-          </w:p>
-        </w:tc>
-        <w:tc>
-          <w:tcPr>
-            <w:tcW w:w="1725" w:type="dxa"/>
-            <w:vAlign w:val="center"/>
-          </w:tcPr>
-          <w:p>
-            <w:pPr>
-              <w:pBdr>
-                <w:top w:val="nil"/>
-                <w:left w:val="nil"/>
-                <w:bottom w:val="nil"/>
-                <w:right w:val="nil"/>
-                <w:between w:val="nil"/>
-              </w:pBdr>
-              <w:spacing w:after="0" w:line="240" w:lineRule="auto"/>
-              <w:jc w:val="center"/>
-              <w:rPr>
-                <w:rFonts w:ascii="Metropolis" w:eastAsia="Metropolis" w:hAnsi="Metropolis" w:cs="Metropolis"/>
-                <w:color w:val="000000"/>
-                <w:sz w:val="20"/>
-                <w:szCs w:val="20"/>
-              </w:rPr>
-            </w:pPr>
-            <w:r>
-              <w:rPr>
-                <w:rFonts w:ascii="Metropolis" w:eastAsia="Metropolis" w:hAnsi="Metropolis" w:cs="Metropolis"/>
-                <w:color w:val="000000"/>
-                <w:sz w:val="20"/>
-                <w:szCs w:val="20"/>
-              </w:rPr>
-              <w:t>{{EQUIPE_LIDER_PROJETO_NOME}}</w:t>
-            </w:r>
-          </w:p>
-        </w:tc>
-        <w:tc>
-          <w:tcPr>
-            <w:tcW w:w="2949" w:type="dxa"/>
-            <w:vAlign w:val="center"/>
-          </w:tcPr>
-          <w:p>
-            <w:pPr>
-              <w:pBdr>
-                <w:top w:val="nil"/>
-                <w:left w:val="nil"/>
-                <w:bottom w:val="nil"/>
-                <w:right w:val="nil"/>
-                <w:between w:val="nil"/>
-              </w:pBdr>
-              <w:spacing w:after="0" w:line="240" w:lineRule="auto"/>
-              <w:jc w:val="center"/>
-              <w:rPr>
-                <w:rFonts w:ascii="Metropolis" w:eastAsia="Metropolis" w:hAnsi="Metropolis" w:cs="Metropolis"/>
-                <w:color w:val="000000"/>
-                <w:sz w:val="20"/>
-                <w:szCs w:val="20"/>
-              </w:rPr>
-            </w:pPr>
-            <w:r>
-              <w:rPr>
-                <w:rFonts w:ascii="Metropolis" w:eastAsia="Metropolis" w:hAnsi="Metropolis" w:cs="Metropolis"/>
-                <w:color w:val="000000"/>
-                <w:sz w:val="20"/>
-                <w:szCs w:val="20"/>
-              </w:rPr>
-              <w:t>{{EQUIPE_LIDER_PROJETO_QUALIFICACAO}}</w:t>
+              <w:t/>
             </w:r>
           </w:p>
         </w:tc>
@@ -5334,7 +4586,37 @@
           <w:rFonts w:ascii="Metropolis" w:eastAsia="Metropolis" w:hAnsi="Metropolis" w:cs="Metropolis"/>
           <w:color w:val="000000"/>
         </w:rPr>
-        <w:t>O referido prazo poderá ter alterações mediante alinhamento formal entre CONTRATANTE e CONTRATADA. Ressalta-se que a CONTRATADA não se responsabiliza pelos prazos de análise, manifestação ou deliberação dos órgãos ambientais e demais órgãos intervenientes.</w:t>
+        <w:t xml:space="preserve">O referido prazo poderá ter alterações mediante alinhamento formal entre CONTRATANTE e </w:t>
+      </w:r>
+      <w:r>
+        <w:rPr>
+          <w:rFonts w:ascii="Metropolis" w:eastAsia="Metropolis" w:hAnsi="Metropolis" w:cs="Metropolis"/>
+          <w:color w:val="000000"/>
+          <w:b/>
+        </w:rPr>
+        <w:t>PAPYRUS</w:t>
+      </w:r>
+      <w:r>
+        <w:rPr>
+          <w:rFonts w:ascii="Metropolis" w:eastAsia="Metropolis" w:hAnsi="Metropolis" w:cs="Metropolis"/>
+          <w:color w:val="000000"/>
+        </w:rPr>
+        <w:t xml:space="preserve">. Ressalta-se que a </w:t>
+      </w:r>
+      <w:r>
+        <w:rPr>
+          <w:rFonts w:ascii="Metropolis" w:eastAsia="Metropolis" w:hAnsi="Metropolis" w:cs="Metropolis"/>
+          <w:color w:val="000000"/>
+          <w:b/>
+        </w:rPr>
+        <w:t>PAPYRUS</w:t>
+      </w:r>
+      <w:r>
+        <w:rPr>
+          <w:rFonts w:ascii="Metropolis" w:eastAsia="Metropolis" w:hAnsi="Metropolis" w:cs="Metropolis"/>
+          <w:color w:val="000000"/>
+        </w:rPr>
+        <w:t xml:space="preserve"> não se responsabiliza pelos prazos de análise, manifestação ou deliberação dos órgãos ambientais e demais órgãos intervenientes.</w:t>
       </w:r>
     </w:p>
     <w:p>
@@ -6741,6 +6023,117 @@
         </w:tc>
       </w:tr>
     </w:tbl>
+    <w:p>
+      <w:pPr>
+        <w:pBdr>
+          <w:top w:val="nil"/>
+          <w:left w:val="nil"/>
+          <w:bottom w:val="nil"/>
+          <w:right w:val="nil"/>
+          <w:between w:val="nil"/>
+        </w:pBdr>
+        <w:spacing w:after="0" w:line="360" w:lineRule="auto"/>
+        <w:jc w:val="both"/>
+        <w:rPr>
+          <w:rFonts w:ascii="Metropolis" w:eastAsia="Metropolis" w:hAnsi="Metropolis" w:cs="Metropolis"/>
+          <w:color w:val="000000"/>
+        </w:rPr>
+      </w:pPr>
+      <w:r>
+        <w:rPr>
+          <w:rFonts w:ascii="Metropolis" w:eastAsia="Metropolis" w:hAnsi="Metropolis" w:cs="Metropolis"/>
+          <w:color w:val="000000"/>
+        </w:rPr>
+        <w:t xml:space="preserve">Os preços deverão ser corrigidos anualmente pelo IGP-M ou IPCA, o que tiver melhor desempenho.</w:t>
+      </w:r>
+    </w:p>
+    <w:p>
+      <w:pPr>
+        <w:pBdr>
+          <w:top w:val="nil"/>
+          <w:left w:val="nil"/>
+          <w:bottom w:val="nil"/>
+          <w:right w:val="nil"/>
+          <w:between w:val="nil"/>
+        </w:pBdr>
+        <w:spacing w:after="0" w:line="360" w:lineRule="auto"/>
+        <w:jc w:val="both"/>
+        <w:rPr>
+          <w:rFonts w:ascii="Metropolis" w:eastAsia="Metropolis" w:hAnsi="Metropolis" w:cs="Metropolis"/>
+          <w:color w:val="000000"/>
+        </w:rPr>
+      </w:pPr>
+      <w:r>
+        <w:rPr>
+          <w:rFonts w:ascii="Metropolis" w:eastAsia="Metropolis" w:hAnsi="Metropolis" w:cs="Metropolis"/>
+          <w:color w:val="000000"/>
+        </w:rPr>
+        <w:t xml:space="preserve">O CNAE Principal da </w:t>
+      </w:r>
+      <w:r>
+        <w:rPr>
+          <w:rFonts w:ascii="Metropolis" w:eastAsia="Metropolis" w:hAnsi="Metropolis" w:cs="Metropolis"/>
+          <w:color w:val="000000"/>
+          <w:b/>
+        </w:rPr>
+        <w:t>PAPYRUS</w:t>
+      </w:r>
+      <w:r>
+        <w:rPr>
+          <w:rFonts w:ascii="Metropolis" w:eastAsia="Metropolis" w:hAnsi="Metropolis" w:cs="Metropolis"/>
+          <w:color w:val="000000"/>
+        </w:rPr>
+        <w:t xml:space="preserve"> é: 74.90-1-99 – Outras atividades profissionais, científicas e técnicas não especificadas anteriormente.</w:t>
+      </w:r>
+    </w:p>
+    <w:p>
+      <w:pPr>
+        <w:pBdr>
+          <w:top w:val="nil"/>
+          <w:left w:val="nil"/>
+          <w:bottom w:val="nil"/>
+          <w:right w:val="nil"/>
+          <w:between w:val="nil"/>
+        </w:pBdr>
+        <w:spacing w:after="0" w:line="360" w:lineRule="auto"/>
+        <w:jc w:val="both"/>
+        <w:rPr>
+          <w:rFonts w:ascii="Metropolis" w:eastAsia="Metropolis" w:hAnsi="Metropolis" w:cs="Metropolis"/>
+          <w:color w:val="000000"/>
+        </w:rPr>
+      </w:pPr>
+      <w:r>
+        <w:rPr>
+          <w:rFonts w:ascii="Metropolis" w:eastAsia="Metropolis" w:hAnsi="Metropolis" w:cs="Metropolis"/>
+          <w:color w:val="000000"/>
+        </w:rPr>
+        <w:t xml:space="preserve">De acordo com a Lei Complementar 116/2003, as notas fiscais serão emitidas para o código 17.01 que se refere ao serviço de “Assessoria ou consultoria de qualquer natureza, análise, pesquisa e fornecimento de dados”.</w:t>
+      </w:r>
+    </w:p>
+    <w:p>
+      <w:pPr>
+        <w:pBdr>
+          <w:top w:val="nil"/>
+          <w:left w:val="nil"/>
+          <w:bottom w:val="nil"/>
+          <w:right w:val="nil"/>
+          <w:between w:val="nil"/>
+        </w:pBdr>
+        <w:spacing w:after="0" w:line="360" w:lineRule="auto"/>
+        <w:jc w:val="both"/>
+        <w:rPr>
+          <w:rFonts w:ascii="Metropolis" w:eastAsia="Metropolis" w:hAnsi="Metropolis" w:cs="Metropolis"/>
+          <w:color w:val="000000"/>
+        </w:rPr>
+      </w:pPr>
+      <w:r>
+        <w:rPr>
+          <w:rFonts w:ascii="Metropolis" w:eastAsia="Metropolis" w:hAnsi="Metropolis" w:cs="Metropolis"/>
+          <w:color w:val="000000"/>
+        </w:rPr>
+        <w:t xml:space="preserve">Impostos Aplicáveis: IR 4,8%, CSLL 2,88%, PIS 0,65%, COFINS 3%, ISS 3% (tributado em Lauro de Freitas).</w:t>
+      </w:r>
+    </w:p>
     <w:p>
       <w:pPr>
         <w:pBdr>

</xml_diff>

<commit_message>
fix: corrige exigencias necessarias
</commit_message>
<xml_diff>
--- a/app/templates/docx/proposta_tecnica_comercial.docx
+++ b/app/templates/docx/proposta_tecnica_comercial.docx
@@ -3300,7 +3300,22 @@
         <w:rPr>
           <w:rFonts w:ascii="Metropolis" w:eastAsia="Metropolis" w:hAnsi="Metropolis" w:cs="Metropolis"/>
         </w:rPr>
-        <w:t>A padronização de todos os documentos estará de acordo com a numeração e formatação padrão dos documentos, conforme exigidos pelo órgão ambiental, estarão enquadrados nos formatos dos pacotes da Microsoft Office (.doc, .xls, .ppt), ESRI (.shp, .dbf), AutoCAD (.dwg, .dxf) e imagens (.jpeg).</w:t>
+        <w:t xml:space="preserve">A padronização de todos os documentos estará de acordo com a numeração e formatação padrão dos documentos, conforme exigidos pelo órgão ambiental, estarão enquadrados nos formatos dos pacotes da Microsoft Office (.doc, .xls, .ppt), ESRI (.shp, .dbf), PDF, AutoCAD (.dwg, .dxf), "shapefile" ou "kml" e imagens (.jpeg).</w:t>
+      </w:r>
+    </w:p>
+    <w:p>
+      <w:pPr>
+        <w:spacing w:after="0" w:line="360" w:lineRule="auto"/>
+        <w:jc w:val="both"/>
+        <w:rPr>
+          <w:rFonts w:ascii="Metropolis" w:eastAsia="Metropolis" w:hAnsi="Metropolis" w:cs="Metropolis"/>
+        </w:rPr>
+      </w:pPr>
+      <w:r>
+        <w:rPr>
+          <w:rFonts w:ascii="Metropolis" w:eastAsia="Metropolis" w:hAnsi="Metropolis" w:cs="Metropolis"/>
+        </w:rPr>
+        <w:t xml:space="preserve">Quando necessário o uso de alguma plataforma para compartilhamento de documentos, será priorizado a utilização de SharePoint ou OneDrive da Contratante.</w:t>
       </w:r>
     </w:p>
     <w:p>
@@ -3342,6 +3357,61 @@
           <w:sz w:val="22"/>
           <w:szCs w:val="22"/>
         </w:rPr>
+        <w:t>ITENS NÃO PREVISTOS</w:t>
+      </w:r>
+    </w:p>
+    <w:p>
+      <w:pPr>
+        <w:spacing w:after="0" w:line="360" w:lineRule="auto"/>
+        <w:jc w:val="both"/>
+        <w:rPr>
+          <w:rFonts w:ascii="Metropolis" w:eastAsia="Metropolis" w:hAnsi="Metropolis" w:cs="Metropolis"/>
+        </w:rPr>
+      </w:pPr>
+      <w:r>
+        <w:rPr>
+          <w:rFonts w:ascii="Metropolis" w:eastAsia="Metropolis" w:hAnsi="Metropolis" w:cs="Metropolis"/>
+        </w:rPr>
+        <w:t xml:space="preserve">{{ITENS_NAO_PREVISTOS}}</w:t>
+      </w:r>
+    </w:p>
+    <w:p>
+      <w:pPr>
+        <w:spacing w:after="0" w:line="360" w:lineRule="auto"/>
+        <w:jc w:val="both"/>
+        <w:rPr>
+          <w:rFonts w:ascii="Metropolis" w:eastAsia="Metropolis" w:hAnsi="Metropolis" w:cs="Metropolis"/>
+        </w:rPr>
+      </w:pPr>
+      <w:r>
+        <w:rPr>
+          <w:rFonts w:ascii="Metropolis" w:eastAsia="Metropolis" w:hAnsi="Metropolis" w:cs="Metropolis"/>
+        </w:rPr>
+        <w:t xml:space="preserve">Caso sejam solicitados serviços e estudos não contemplados nesta proposta, estes serão objeto de proposta complementar.</w:t>
+      </w:r>
+    </w:p>
+    <w:p>
+      <w:pPr>
+        <w:pStyle w:val="Ttulo1"/>
+        <w:numPr>
+          <w:ilvl w:val="0"/>
+          <w:numId w:val="1"/>
+        </w:numPr>
+        <w:spacing w:before="0" w:after="0" w:line="360" w:lineRule="auto"/>
+        <w:ind w:left="0" w:firstLine="0"/>
+        <w:jc w:val="both"/>
+        <w:rPr>
+          <w:rFonts w:ascii="Metropolis" w:eastAsia="Metropolis" w:hAnsi="Metropolis" w:cs="Metropolis"/>
+          <w:sz w:val="22"/>
+          <w:szCs w:val="22"/>
+        </w:rPr>
+      </w:pPr>
+      <w:r>
+        <w:rPr>
+          <w:rFonts w:ascii="Metropolis" w:eastAsia="Metropolis" w:hAnsi="Metropolis" w:cs="Metropolis"/>
+          <w:sz w:val="22"/>
+          <w:szCs w:val="22"/>
+        </w:rPr>
         <w:t>RESPONSABILIDADES DAS PARTES</w:t>
       </w:r>
     </w:p>
@@ -3379,7 +3449,7 @@
           <w:sz w:val="22"/>
           <w:szCs w:val="22"/>
         </w:rPr>
-        <w:t>7.1 OBRIGAÇÕES DA PAPYRUS</w:t>
+        <w:t>8.1 OBRIGAÇÕES DA PAPYRUS</w:t>
       </w:r>
     </w:p>
     <w:p>
@@ -3697,7 +3767,7 @@
           <w:sz w:val="22"/>
           <w:szCs w:val="22"/>
         </w:rPr>
-        <w:t>7.2 OBRIGAÇÕES DA EMPRESA CONTRATANTE</w:t>
+        <w:t>8.2 OBRIGAÇÕES DA EMPRESA CONTRATANTE</w:t>
       </w:r>
     </w:p>
     <w:p>
@@ -4105,7 +4175,7 @@
           <w:b/>
           <w:color w:val="000000"/>
         </w:rPr>
-        <w:t>Quadro 8-1</w:t>
+        <w:t>Quadro 9-1</w:t>
       </w:r>
       <w:r>
         <w:rPr>
@@ -4151,7 +4221,7 @@
           <w:sz w:val="20"/>
           <w:szCs w:val="20"/>
         </w:rPr>
-        <w:t>Quadro 8-1</w:t>
+        <w:t>Quadro 9-1</w:t>
       </w:r>
       <w:r>
         <w:rPr>
@@ -5080,7 +5150,7 @@
           <w:rFonts w:ascii="Metropolis" w:eastAsia="Metropolis" w:hAnsi="Metropolis" w:cs="Metropolis"/>
           <w:b/>
         </w:rPr>
-        <w:t>Quadro 11-1</w:t>
+        <w:t>Quadro 12-1</w:t>
       </w:r>
       <w:r>
         <w:rPr>
@@ -5131,7 +5201,7 @@
           <w:sz w:val="20"/>
           <w:szCs w:val="20"/>
         </w:rPr>
-        <w:t>Quadro 11-1</w:t>
+        <w:t>Quadro 12-1</w:t>
       </w:r>
       <w:r>
         <w:rPr>

</xml_diff>

<commit_message>
fix: corrige funcionalidades do docx
</commit_message>
<xml_diff>
--- a/app/templates/docx/proposta_tecnica_comercial.docx
+++ b/app/templates/docx/proposta_tecnica_comercial.docx
@@ -5130,14 +5130,14 @@
         <w:rPr>
           <w:rFonts w:ascii="Metropolis" w:eastAsia="Metropolis" w:hAnsi="Metropolis" w:cs="Metropolis"/>
         </w:rPr>
-        <w:t xml:space="preserve">O preço proposto para a execução dos serviços é de </w:t>
+        <w:t xml:space="preserve">O preço proposto para a execução dos serviços está no </w:t>
       </w:r>
       <w:r>
         <w:rPr>
           <w:rFonts w:ascii="Metropolis" w:eastAsia="Metropolis" w:hAnsi="Metropolis" w:cs="Metropolis"/>
           <w:b/>
         </w:rPr>
-        <w:t xml:space="preserve">{{PRECO_TOTAL}}</w:t>
+        <w:t>Quadro 12-1</w:t>
       </w:r>
       <w:r>
         <w:rPr>
@@ -5150,7 +5150,7 @@
           <w:rFonts w:ascii="Metropolis" w:eastAsia="Metropolis" w:hAnsi="Metropolis" w:cs="Metropolis"/>
           <w:b/>
         </w:rPr>
-        <w:t>Quadro 12-1</w:t>
+        <w:t>Quadro 12-2</w:t>
       </w:r>
       <w:r>
         <w:rPr>
@@ -5210,7 +5210,7 @@
           <w:sz w:val="20"/>
           <w:szCs w:val="20"/>
         </w:rPr>
-        <w:t xml:space="preserve">: Desembolso </w:t>
+        <w:t xml:space="preserve">: Preço</w:t>
       </w:r>
     </w:p>
     <w:tbl>
@@ -5232,8 +5232,7 @@
       <w:tblGrid>
         <w:gridCol w:w="501"/>
         <w:gridCol w:w="4542"/>
-        <w:gridCol w:w="1701"/>
-        <w:gridCol w:w="1701"/>
+        <w:gridCol w:w="3402"/>
       </w:tblGrid>
       <w:tr>
         <w:trPr>
@@ -5298,13 +5297,13 @@
                 <w:sz w:val="20"/>
                 <w:szCs w:val="20"/>
               </w:rPr>
-              <w:t>MARCO</w:t>
+              <w:t>SERVIÇO</w:t>
             </w:r>
           </w:p>
         </w:tc>
         <w:tc>
           <w:tcPr>
-            <w:tcW w:w="1701" w:type="dxa"/>
+            <w:tcW w:w="3402" w:type="dxa"/>
             <w:vAlign w:val="center"/>
           </w:tcPr>
           <w:p>
@@ -5325,34 +5324,7 @@
                 <w:sz w:val="20"/>
                 <w:szCs w:val="20"/>
               </w:rPr>
-              <w:t>R$</w:t>
-            </w:r>
-          </w:p>
-        </w:tc>
-        <w:tc>
-          <w:tcPr>
-            <w:tcW w:w="1701" w:type="dxa"/>
-            <w:vAlign w:val="center"/>
-          </w:tcPr>
-          <w:p>
-            <w:pPr>
-              <w:spacing w:after="0" w:line="360" w:lineRule="auto"/>
-              <w:jc w:val="center"/>
-              <w:rPr>
-                <w:rFonts w:ascii="Metropolis" w:eastAsia="Metropolis" w:hAnsi="Metropolis" w:cs="Metropolis"/>
-                <w:b/>
-                <w:sz w:val="20"/>
-                <w:szCs w:val="20"/>
-              </w:rPr>
-            </w:pPr>
-            <w:r>
-              <w:rPr>
-                <w:rFonts w:ascii="Metropolis" w:eastAsia="Metropolis" w:hAnsi="Metropolis" w:cs="Metropolis"/>
-                <w:b/>
-                <w:sz w:val="20"/>
-                <w:szCs w:val="20"/>
-              </w:rPr>
-              <w:t>DATA</w:t>
+              <w:t>PREÇO R$</w:t>
             </w:r>
           </w:p>
         </w:tc>
@@ -5404,7 +5376,7 @@
         </w:tc>
         <w:tc>
           <w:tcPr>
-            <w:tcW w:w="1701" w:type="dxa"/>
+            <w:tcW w:w="3402" w:type="dxa"/>
             <w:vAlign w:val="center"/>
           </w:tcPr>
           <w:p>
@@ -5419,21 +5391,157 @@
             </w:pPr>
           </w:p>
         </w:tc>
-        <w:tc>
-          <w:tcPr>
-            <w:tcW w:w="1701" w:type="dxa"/>
+      </w:tr>
+    </w:tbl>
+    <w:p>
+      <w:pPr>
+        <w:pBdr>
+          <w:top w:val="nil"/>
+          <w:left w:val="nil"/>
+          <w:bottom w:val="nil"/>
+          <w:right w:val="nil"/>
+          <w:between w:val="nil"/>
+        </w:pBdr>
+        <w:spacing w:after="0" w:line="360" w:lineRule="auto"/>
+        <w:jc w:val="both"/>
+        <w:rPr>
+          <w:rFonts w:ascii="Metropolis" w:eastAsia="Metropolis" w:hAnsi="Metropolis" w:cs="Metropolis"/>
+          <w:color w:val="000000"/>
+        </w:rPr>
+      </w:pPr>
+      <w:r>
+        <w:rPr>
+          <w:rFonts w:ascii="Metropolis" w:eastAsia="Metropolis" w:hAnsi="Metropolis" w:cs="Metropolis"/>
+          <w:b/>
+          <w:color w:val="000000"/>
+          <w:sz w:val="20"/>
+          <w:szCs w:val="20"/>
+        </w:rPr>
+        <w:t>Quadro 12-2</w:t>
+      </w:r>
+      <w:r>
+        <w:rPr>
+          <w:rFonts w:ascii="Metropolis" w:eastAsia="Metropolis" w:hAnsi="Metropolis" w:cs="Metropolis"/>
+          <w:color w:val="000000"/>
+          <w:sz w:val="20"/>
+          <w:szCs w:val="20"/>
+        </w:rPr>
+        <w:t xml:space="preserve">: Desembolso </w:t>
+      </w:r>
+    </w:p>
+    <w:tbl>
+      <w:tblPr>
+        <w:tblStyle w:val="a3"/>
+        <w:tblW w:w="8445" w:type="dxa"/>
+        <w:tblInd w:w="55" w:type="dxa"/>
+        <w:tblBorders>
+          <w:top w:val="single" w:sz="4" w:space="0" w:color="000000"/>
+          <w:left w:val="single" w:sz="4" w:space="0" w:color="000000"/>
+          <w:bottom w:val="single" w:sz="4" w:space="0" w:color="000000"/>
+          <w:right w:val="single" w:sz="4" w:space="0" w:color="000000"/>
+          <w:insideH w:val="single" w:sz="4" w:space="0" w:color="000000"/>
+          <w:insideV w:val="single" w:sz="4" w:space="0" w:color="000000"/>
+        </w:tblBorders>
+        <w:tblLayout w:type="fixed"/>
+        <w:tblLook w:val="0000" w:firstRow="0" w:lastRow="0" w:firstColumn="0" w:lastColumn="0" w:noHBand="0" w:noVBand="0"/>
+      </w:tblPr>
+      <w:tblGrid>
+        <w:gridCol w:w="501"/>
+        <w:gridCol w:w="4542"/>
+        <w:gridCol w:w="3402"/>
+      </w:tblGrid>
+      <w:tr>
+        <w:trPr>
+          <w:trHeight w:val="345"/>
+          <w:tblHeader/>
+        </w:trPr>
+        <w:tc>
+          <w:tcPr>
+            <w:tcW w:w="501" w:type="dxa"/>
             <w:vAlign w:val="center"/>
           </w:tcPr>
           <w:p>
             <w:pPr>
-              <w:spacing w:after="0"/>
+              <w:spacing w:after="0" w:line="360" w:lineRule="auto"/>
               <w:jc w:val="center"/>
               <w:rPr>
                 <w:rFonts w:ascii="Metropolis" w:eastAsia="Metropolis" w:hAnsi="Metropolis" w:cs="Metropolis"/>
-                <w:sz w:val="20"/>
-                <w:szCs w:val="20"/>
-              </w:rPr>
-            </w:pPr>
+                <w:b/>
+                <w:sz w:val="20"/>
+                <w:szCs w:val="20"/>
+              </w:rPr>
+            </w:pPr>
+            <w:r>
+              <w:rPr>
+                <w:rFonts w:ascii="Metropolis" w:eastAsia="Metropolis" w:hAnsi="Metropolis" w:cs="Metropolis"/>
+                <w:b/>
+                <w:sz w:val="20"/>
+                <w:szCs w:val="20"/>
+              </w:rPr>
+              <w:t>N</w:t>
+            </w:r>
+            <w:r>
+              <w:rPr>
+                <w:b/>
+                <w:sz w:val="20"/>
+                <w:szCs w:val="20"/>
+              </w:rPr>
+              <w:t>°</w:t>
+            </w:r>
+          </w:p>
+        </w:tc>
+        <w:tc>
+          <w:tcPr>
+            <w:tcW w:w="4542" w:type="dxa"/>
+            <w:vAlign w:val="center"/>
+          </w:tcPr>
+          <w:p>
+            <w:pPr>
+              <w:spacing w:after="0" w:line="360" w:lineRule="auto"/>
+              <w:jc w:val="center"/>
+              <w:rPr>
+                <w:rFonts w:ascii="Metropolis" w:eastAsia="Metropolis" w:hAnsi="Metropolis" w:cs="Metropolis"/>
+                <w:b/>
+                <w:sz w:val="20"/>
+                <w:szCs w:val="20"/>
+              </w:rPr>
+            </w:pPr>
+            <w:r>
+              <w:rPr>
+                <w:rFonts w:ascii="Metropolis" w:eastAsia="Metropolis" w:hAnsi="Metropolis" w:cs="Metropolis"/>
+                <w:b/>
+                <w:sz w:val="20"/>
+                <w:szCs w:val="20"/>
+              </w:rPr>
+              <w:t>MARCO</w:t>
+            </w:r>
+          </w:p>
+        </w:tc>
+        <w:tc>
+          <w:tcPr>
+            <w:tcW w:w="3402" w:type="dxa"/>
+            <w:vAlign w:val="center"/>
+          </w:tcPr>
+          <w:p>
+            <w:pPr>
+              <w:spacing w:after="0" w:line="360" w:lineRule="auto"/>
+              <w:jc w:val="center"/>
+              <w:rPr>
+                <w:rFonts w:ascii="Metropolis" w:eastAsia="Metropolis" w:hAnsi="Metropolis" w:cs="Metropolis"/>
+                <w:b/>
+                <w:sz w:val="20"/>
+                <w:szCs w:val="20"/>
+              </w:rPr>
+            </w:pPr>
+            <w:r>
+              <w:rPr>
+                <w:rFonts w:ascii="Metropolis" w:eastAsia="Metropolis" w:hAnsi="Metropolis" w:cs="Metropolis"/>
+                <w:b/>
+                <w:sz w:val="20"/>
+                <w:szCs w:val="20"/>
+              </w:rPr>
+              <w:t>% DO ITEM</w:t>
+            </w:r>
           </w:p>
         </w:tc>
       </w:tr>
@@ -5462,7 +5570,7 @@
                 <w:sz w:val="20"/>
                 <w:szCs w:val="20"/>
               </w:rPr>
-              <w:t>2</w:t>
+              <w:t>1</w:t>
             </w:r>
           </w:p>
         </w:tc>
@@ -5484,24 +5592,7 @@
         </w:tc>
         <w:tc>
           <w:tcPr>
-            <w:tcW w:w="1701" w:type="dxa"/>
-            <w:vAlign w:val="center"/>
-          </w:tcPr>
-          <w:p>
-            <w:pPr>
-              <w:spacing w:after="0"/>
-              <w:jc w:val="center"/>
-              <w:rPr>
-                <w:rFonts w:ascii="Metropolis" w:eastAsia="Metropolis" w:hAnsi="Metropolis" w:cs="Metropolis"/>
-                <w:sz w:val="20"/>
-                <w:szCs w:val="20"/>
-              </w:rPr>
-            </w:pPr>
-          </w:p>
-        </w:tc>
-        <w:tc>
-          <w:tcPr>
-            <w:tcW w:w="1701" w:type="dxa"/>
+            <w:tcW w:w="3402" w:type="dxa"/>
             <w:vAlign w:val="center"/>
           </w:tcPr>
           <w:p>
@@ -5542,7 +5633,7 @@
                 <w:sz w:val="20"/>
                 <w:szCs w:val="20"/>
               </w:rPr>
-              <w:t>3</w:t>
+              <w:t>2</w:t>
             </w:r>
           </w:p>
         </w:tc>
@@ -5564,24 +5655,7 @@
         </w:tc>
         <w:tc>
           <w:tcPr>
-            <w:tcW w:w="1701" w:type="dxa"/>
-            <w:vAlign w:val="center"/>
-          </w:tcPr>
-          <w:p>
-            <w:pPr>
-              <w:spacing w:after="0"/>
-              <w:jc w:val="center"/>
-              <w:rPr>
-                <w:rFonts w:ascii="Metropolis" w:eastAsia="Metropolis" w:hAnsi="Metropolis" w:cs="Metropolis"/>
-                <w:sz w:val="20"/>
-                <w:szCs w:val="20"/>
-              </w:rPr>
-            </w:pPr>
-          </w:p>
-        </w:tc>
-        <w:tc>
-          <w:tcPr>
-            <w:tcW w:w="1701" w:type="dxa"/>
+            <w:tcW w:w="3402" w:type="dxa"/>
             <w:vAlign w:val="center"/>
           </w:tcPr>
           <w:p>
@@ -5622,7 +5696,7 @@
                 <w:sz w:val="20"/>
                 <w:szCs w:val="20"/>
               </w:rPr>
-              <w:t>4</w:t>
+              <w:t>3</w:t>
             </w:r>
           </w:p>
         </w:tc>
@@ -5644,24 +5718,7 @@
         </w:tc>
         <w:tc>
           <w:tcPr>
-            <w:tcW w:w="1701" w:type="dxa"/>
-            <w:vAlign w:val="center"/>
-          </w:tcPr>
-          <w:p>
-            <w:pPr>
-              <w:spacing w:after="0"/>
-              <w:jc w:val="center"/>
-              <w:rPr>
-                <w:rFonts w:ascii="Metropolis" w:eastAsia="Metropolis" w:hAnsi="Metropolis" w:cs="Metropolis"/>
-                <w:sz w:val="20"/>
-                <w:szCs w:val="20"/>
-              </w:rPr>
-            </w:pPr>
-          </w:p>
-        </w:tc>
-        <w:tc>
-          <w:tcPr>
-            <w:tcW w:w="1701" w:type="dxa"/>
+            <w:tcW w:w="3402" w:type="dxa"/>
             <w:vAlign w:val="center"/>
           </w:tcPr>
           <w:p>
@@ -5702,7 +5759,7 @@
                 <w:sz w:val="20"/>
                 <w:szCs w:val="20"/>
               </w:rPr>
-              <w:t>5</w:t>
+              <w:t>4</w:t>
             </w:r>
           </w:p>
         </w:tc>
@@ -5716,16 +5773,15 @@
               <w:spacing w:after="0"/>
               <w:rPr>
                 <w:rFonts w:ascii="Metropolis" w:eastAsia="Metropolis" w:hAnsi="Metropolis" w:cs="Metropolis"/>
-                <w:color w:val="000000"/>
-                <w:sz w:val="20"/>
-                <w:szCs w:val="20"/>
-              </w:rPr>
-            </w:pPr>
-          </w:p>
-        </w:tc>
-        <w:tc>
-          <w:tcPr>
-            <w:tcW w:w="1701" w:type="dxa"/>
+                <w:sz w:val="20"/>
+                <w:szCs w:val="20"/>
+              </w:rPr>
+            </w:pPr>
+          </w:p>
+        </w:tc>
+        <w:tc>
+          <w:tcPr>
+            <w:tcW w:w="3402" w:type="dxa"/>
             <w:vAlign w:val="center"/>
           </w:tcPr>
           <w:p>
@@ -5734,25 +5790,6 @@
               <w:jc w:val="center"/>
               <w:rPr>
                 <w:rFonts w:ascii="Metropolis" w:eastAsia="Metropolis" w:hAnsi="Metropolis" w:cs="Metropolis"/>
-                <w:color w:val="000000"/>
-                <w:sz w:val="20"/>
-                <w:szCs w:val="20"/>
-              </w:rPr>
-            </w:pPr>
-          </w:p>
-        </w:tc>
-        <w:tc>
-          <w:tcPr>
-            <w:tcW w:w="1701" w:type="dxa"/>
-            <w:vAlign w:val="center"/>
-          </w:tcPr>
-          <w:p>
-            <w:pPr>
-              <w:spacing w:after="0"/>
-              <w:jc w:val="center"/>
-              <w:rPr>
-                <w:rFonts w:ascii="Metropolis" w:eastAsia="Metropolis" w:hAnsi="Metropolis" w:cs="Metropolis"/>
-                <w:color w:val="000000"/>
                 <w:sz w:val="20"/>
                 <w:szCs w:val="20"/>
               </w:rPr>
@@ -5785,7 +5822,7 @@
                 <w:sz w:val="20"/>
                 <w:szCs w:val="20"/>
               </w:rPr>
-              <w:t>6</w:t>
+              <w:t>5</w:t>
             </w:r>
           </w:p>
         </w:tc>
@@ -5808,25 +5845,7 @@
         </w:tc>
         <w:tc>
           <w:tcPr>
-            <w:tcW w:w="1701" w:type="dxa"/>
-            <w:vAlign w:val="center"/>
-          </w:tcPr>
-          <w:p>
-            <w:pPr>
-              <w:spacing w:after="0"/>
-              <w:jc w:val="center"/>
-              <w:rPr>
-                <w:rFonts w:ascii="Metropolis" w:eastAsia="Metropolis" w:hAnsi="Metropolis" w:cs="Metropolis"/>
-                <w:color w:val="000000"/>
-                <w:sz w:val="20"/>
-                <w:szCs w:val="20"/>
-              </w:rPr>
-            </w:pPr>
-          </w:p>
-        </w:tc>
-        <w:tc>
-          <w:tcPr>
-            <w:tcW w:w="1701" w:type="dxa"/>
+            <w:tcW w:w="3402" w:type="dxa"/>
             <w:vAlign w:val="center"/>
           </w:tcPr>
           <w:p>
@@ -5868,7 +5887,7 @@
                 <w:sz w:val="20"/>
                 <w:szCs w:val="20"/>
               </w:rPr>
-              <w:t>7</w:t>
+              <w:t>6</w:t>
             </w:r>
           </w:p>
         </w:tc>
@@ -5891,25 +5910,7 @@
         </w:tc>
         <w:tc>
           <w:tcPr>
-            <w:tcW w:w="1701" w:type="dxa"/>
-            <w:vAlign w:val="center"/>
-          </w:tcPr>
-          <w:p>
-            <w:pPr>
-              <w:spacing w:after="0"/>
-              <w:jc w:val="center"/>
-              <w:rPr>
-                <w:rFonts w:ascii="Metropolis" w:eastAsia="Metropolis" w:hAnsi="Metropolis" w:cs="Metropolis"/>
-                <w:color w:val="000000"/>
-                <w:sz w:val="20"/>
-                <w:szCs w:val="20"/>
-              </w:rPr>
-            </w:pPr>
-          </w:p>
-        </w:tc>
-        <w:tc>
-          <w:tcPr>
-            <w:tcW w:w="1701" w:type="dxa"/>
+            <w:tcW w:w="3402" w:type="dxa"/>
             <w:vAlign w:val="center"/>
           </w:tcPr>
           <w:p>
@@ -5951,7 +5952,7 @@
                 <w:sz w:val="20"/>
                 <w:szCs w:val="20"/>
               </w:rPr>
-              <w:t>8</w:t>
+              <w:t>7</w:t>
             </w:r>
           </w:p>
         </w:tc>
@@ -5974,25 +5975,7 @@
         </w:tc>
         <w:tc>
           <w:tcPr>
-            <w:tcW w:w="1701" w:type="dxa"/>
-            <w:vAlign w:val="center"/>
-          </w:tcPr>
-          <w:p>
-            <w:pPr>
-              <w:spacing w:after="0"/>
-              <w:jc w:val="center"/>
-              <w:rPr>
-                <w:rFonts w:ascii="Metropolis" w:eastAsia="Metropolis" w:hAnsi="Metropolis" w:cs="Metropolis"/>
-                <w:color w:val="000000"/>
-                <w:sz w:val="20"/>
-                <w:szCs w:val="20"/>
-              </w:rPr>
-            </w:pPr>
-          </w:p>
-        </w:tc>
-        <w:tc>
-          <w:tcPr>
-            <w:tcW w:w="1701" w:type="dxa"/>
+            <w:tcW w:w="3402" w:type="dxa"/>
             <w:vAlign w:val="center"/>
           </w:tcPr>
           <w:p>
@@ -6034,6 +6017,71 @@
                 <w:sz w:val="20"/>
                 <w:szCs w:val="20"/>
               </w:rPr>
+              <w:t>8</w:t>
+            </w:r>
+          </w:p>
+        </w:tc>
+        <w:tc>
+          <w:tcPr>
+            <w:tcW w:w="4542" w:type="dxa"/>
+            <w:vAlign w:val="center"/>
+          </w:tcPr>
+          <w:p>
+            <w:pPr>
+              <w:spacing w:after="0"/>
+              <w:rPr>
+                <w:rFonts w:ascii="Metropolis" w:eastAsia="Metropolis" w:hAnsi="Metropolis" w:cs="Metropolis"/>
+                <w:color w:val="000000"/>
+                <w:sz w:val="20"/>
+                <w:szCs w:val="20"/>
+              </w:rPr>
+            </w:pPr>
+          </w:p>
+        </w:tc>
+        <w:tc>
+          <w:tcPr>
+            <w:tcW w:w="3402" w:type="dxa"/>
+            <w:vAlign w:val="center"/>
+          </w:tcPr>
+          <w:p>
+            <w:pPr>
+              <w:spacing w:after="0"/>
+              <w:jc w:val="center"/>
+              <w:rPr>
+                <w:rFonts w:ascii="Metropolis" w:eastAsia="Metropolis" w:hAnsi="Metropolis" w:cs="Metropolis"/>
+                <w:color w:val="000000"/>
+                <w:sz w:val="20"/>
+                <w:szCs w:val="20"/>
+              </w:rPr>
+            </w:pPr>
+          </w:p>
+        </w:tc>
+      </w:tr>
+      <w:tr>
+        <w:trPr>
+          <w:trHeight w:val="345"/>
+        </w:trPr>
+        <w:tc>
+          <w:tcPr>
+            <w:tcW w:w="501" w:type="dxa"/>
+            <w:vAlign w:val="center"/>
+          </w:tcPr>
+          <w:p>
+            <w:pPr>
+              <w:spacing w:after="0" w:line="360" w:lineRule="auto"/>
+              <w:jc w:val="center"/>
+              <w:rPr>
+                <w:rFonts w:ascii="Metropolis" w:eastAsia="Metropolis" w:hAnsi="Metropolis" w:cs="Metropolis"/>
+                <w:sz w:val="20"/>
+                <w:szCs w:val="20"/>
+              </w:rPr>
+            </w:pPr>
+            <w:r>
+              <w:rPr>
+                <w:rFonts w:ascii="Metropolis" w:eastAsia="Metropolis" w:hAnsi="Metropolis" w:cs="Metropolis"/>
+                <w:sz w:val="20"/>
+                <w:szCs w:val="20"/>
+              </w:rPr>
               <w:t>9</w:t>
             </w:r>
           </w:p>
@@ -6057,25 +6105,7 @@
         </w:tc>
         <w:tc>
           <w:tcPr>
-            <w:tcW w:w="1701" w:type="dxa"/>
-            <w:vAlign w:val="center"/>
-          </w:tcPr>
-          <w:p>
-            <w:pPr>
-              <w:spacing w:after="0"/>
-              <w:jc w:val="center"/>
-              <w:rPr>
-                <w:rFonts w:ascii="Metropolis" w:eastAsia="Metropolis" w:hAnsi="Metropolis" w:cs="Metropolis"/>
-                <w:color w:val="000000"/>
-                <w:sz w:val="20"/>
-                <w:szCs w:val="20"/>
-              </w:rPr>
-            </w:pPr>
-          </w:p>
-        </w:tc>
-        <w:tc>
-          <w:tcPr>
-            <w:tcW w:w="1701" w:type="dxa"/>
+            <w:tcW w:w="3402" w:type="dxa"/>
             <w:vAlign w:val="center"/>
           </w:tcPr>
           <w:p>
@@ -7052,6 +7082,415 @@
               <wp:simplePos x="0" y="0"/>
               <wp:positionH relativeFrom="column">
                 <wp:posOffset>2095500</wp:posOffset>
+              </wp:positionH>
+              <wp:positionV relativeFrom="paragraph">
+                <wp:posOffset>76200</wp:posOffset>
+              </wp:positionV>
+              <wp:extent cx="970915" cy="270510"/>
+              <wp:effectExtent b="0" l="0" r="0" t="0"/>
+              <wp:wrapNone/>
+              <wp:docPr id="195" name="image8.png"/>
+              <a:graphic>
+                <a:graphicData uri="http://schemas.openxmlformats.org/drawingml/2006/picture">
+                  <pic:pic>
+                    <pic:nvPicPr>
+                      <pic:cNvPr id="0" name="image8.png"/>
+                      <pic:cNvPicPr preferRelativeResize="0"/>
+                    </pic:nvPicPr>
+                    <pic:blipFill>
+                      <a:blip r:embed="rId2"/>
+                      <a:srcRect/>
+                      <a:stretch>
+                        <a:fillRect/>
+                      </a:stretch>
+                    </pic:blipFill>
+                    <pic:spPr>
+                      <a:xfrm>
+                        <a:off x="0" y="0"/>
+                        <a:ext cx="970915" cy="270510"/>
+                      </a:xfrm>
+                      <a:prstGeom prst="rect"/>
+                      <a:ln/>
+                    </pic:spPr>
+                  </pic:pic>
+                </a:graphicData>
+              </a:graphic>
+            </wp:anchor>
+          </w:drawing>
+        </mc:Fallback>
+      </mc:AlternateContent>
+    </w:r>
+  </w:p>
+</w:ftr>
+</file>
+
+<file path=word/footer2.xml><?xml version="1.0" encoding="utf-8"?>
+<w:ftr xmlns:wpc="http://schemas.microsoft.com/office/word/2010/wordprocessingCanvas" xmlns:cx="http://schemas.microsoft.com/office/drawing/2014/chartex" xmlns:cx1="http://schemas.microsoft.com/office/drawing/2015/9/8/chartex" xmlns:cx2="http://schemas.microsoft.com/office/drawing/2015/10/21/chartex" xmlns:cx3="http://schemas.microsoft.com/office/drawing/2016/5/9/chartex" xmlns:cx4="http://schemas.microsoft.com/office/drawing/2016/5/10/chartex" xmlns:cx5="http://schemas.microsoft.com/office/drawing/2016/5/11/chartex" xmlns:cx6="http://schemas.microsoft.com/office/drawing/2016/5/12/chartex" xmlns:cx7="http://schemas.microsoft.com/office/drawing/2016/5/13/chartex" xmlns:cx8="http://schemas.microsoft.com/office/drawing/2016/5/14/chartex" xmlns:mc="http://schemas.openxmlformats.org/markup-compatibility/2006" xmlns:aink="http://schemas.microsoft.com/office/drawing/2016/ink" xmlns:am3d="http://schemas.microsoft.com/office/drawing/2017/model3d" xmlns:o="urn:schemas-microsoft-com:office:office" xmlns:oel="http://schemas.microsoft.com/office/2019/extlst" xmlns:r="http://schemas.openxmlformats.org/officeDocument/2006/relationships" xmlns:m="http://schemas.openxmlformats.org/officeDocument/2006/math" xmlns:v="urn:schemas-microsoft-com:vml" xmlns:wp14="http://schemas.microsoft.com/office/word/2010/wordprocessingDrawing" xmlns:wp="http://schemas.openxmlformats.org/drawingml/2006/wordprocessingDrawing" xmlns:w10="urn:schemas-microsoft-com:office:word" xmlns:w="http://schemas.openxmlformats.org/wordprocessingml/2006/main" xmlns:w14="http://schemas.microsoft.com/office/word/2010/wordml" xmlns:w15="http://schemas.microsoft.com/office/word/2012/wordml" xmlns:w16cex="http://schemas.microsoft.com/office/word/2018/wordml/cex" xmlns:w16cid="http://schemas.microsoft.com/office/word/2016/wordml/cid" xmlns:w16="http://schemas.microsoft.com/office/word/2018/wordml" xmlns:w16du="http://schemas.microsoft.com/office/word/2023/wordml/word16du" xmlns:w16sdtdh="http://schemas.microsoft.com/office/word/2020/wordml/sdtdatahash" xmlns:w16sdtfl="http://schemas.microsoft.com/office/word/2024/wordml/sdtformatlock" xmlns:w16se="http://schemas.microsoft.com/office/word/2015/wordml/symex" xmlns:wpg="http://schemas.microsoft.com/office/word/2010/wordprocessingGroup" xmlns:wpi="http://schemas.microsoft.com/office/word/2010/wordprocessingInk" xmlns:wne="http://schemas.microsoft.com/office/word/2006/wordml" xmlns:wps="http://schemas.microsoft.com/office/word/2010/wordprocessingShape" mc:Ignorable="w14 w15 w16se w16cid w16 w16cex w16sdtdh w16sdtfl w16du wp14">
+  <w:p>
+    <w:pPr>
+      <w:keepLines/>
+      <w:pBdr>
+        <w:top w:val="nil"/>
+        <w:left w:val="nil"/>
+        <w:bottom w:val="nil"/>
+        <w:right w:val="nil"/>
+        <w:between w:val="nil"/>
+      </w:pBdr>
+      <w:tabs>
+        <w:tab w:val="center" w:pos="4320"/>
+        <w:tab w:val="right" w:pos="8640"/>
+      </w:tabs>
+      <w:spacing w:after="0" w:line="240" w:lineRule="auto"/>
+      <w:jc w:val="center"/>
+      <w:rPr>
+        <w:rFonts w:ascii="Arial" w:eastAsia="Arial" w:hAnsi="Arial" w:cs="Arial"/>
+        <w:color w:val="000000"/>
+        <w:sz w:val="20"/>
+        <w:szCs w:val="20"/>
+      </w:rPr>
+    </w:pPr>
+    <w:r>
+      <w:rPr>
+        <w:noProof/>
+      </w:rPr>
+      <mc:AlternateContent>
+        <mc:Choice Requires="wps">
+          <w:drawing>
+            <wp:anchor distT="45720" distB="45720" distL="114300" distR="114300" simplePos="0" relativeHeight="251661312" behindDoc="0" locked="0" layoutInCell="1" hidden="0" allowOverlap="1" wp14:anchorId="59DAB714" wp14:editId="534B3CF6">
+              <wp:simplePos x="0" y="0"/>
+              <wp:positionH relativeFrom="column">
+                <wp:posOffset>1504950</wp:posOffset>
+              </wp:positionH>
+              <wp:positionV relativeFrom="paragraph">
+                <wp:posOffset>-50165</wp:posOffset>
+              </wp:positionV>
+              <wp:extent cx="5650230" cy="1414145"/>
+              <wp:effectExtent l="0" t="0" r="0" b="0"/>
+              <wp:wrapNone/>
+              <wp:docPr id="196" name="Retângulo 196"/>
+              <wp:cNvGraphicFramePr/>
+              <a:graphic xmlns:a="http://schemas.openxmlformats.org/drawingml/2006/main">
+                <a:graphicData uri="http://schemas.microsoft.com/office/word/2010/wordprocessingShape">
+                  <wps:wsp>
+                    <wps:cNvSpPr/>
+                    <wps:spPr>
+                      <a:xfrm>
+                        <a:off x="0" y="0"/>
+                        <a:ext cx="5650230" cy="1414145"/>
+                      </a:xfrm>
+                      <a:prstGeom prst="rect">
+                        <a:avLst/>
+                      </a:prstGeom>
+                      <a:noFill/>
+                      <a:ln>
+                        <a:noFill/>
+                      </a:ln>
+                    </wps:spPr>
+                    <wps:txbx>
+                      <w:txbxContent>
+                        <w:p>
+                          <w:pPr>
+                            <w:spacing w:after="0" w:line="240" w:lineRule="auto"/>
+                            <w:jc w:val="center"/>
+                            <w:textDirection w:val="btLr"/>
+                          </w:pPr>
+                          <w:r>
+                            <w:rPr>
+                              <w:rFonts w:ascii="Metropolis" w:eastAsia="Metropolis" w:hAnsi="Metropolis" w:cs="Metropolis"/>
+                              <w:color w:val="000000"/>
+                              <w:sz w:val="20"/>
+                            </w:rPr>
+                            <w:t>www.somospapyrus.com.br</w:t>
+                          </w:r>
+                        </w:p>
+                      </w:txbxContent>
+                    </wps:txbx>
+                    <wps:bodyPr spcFirstLastPara="1" wrap="square" lIns="91425" tIns="45700" rIns="91425" bIns="45700" anchor="t" anchorCtr="0">
+                      <a:noAutofit/>
+                    </wps:bodyPr>
+                  </wps:wsp>
+                </a:graphicData>
+              </a:graphic>
+            </wp:anchor>
+          </w:drawing>
+        </mc:Choice>
+        <mc:Fallback>
+          <w:pict>
+            <v:rect w14:anchorId="59DAB714" id="_x0000_s1028" style="position:absolute;left:0;text-align:left;margin-left:118.5pt;margin-top:-3.95pt;width:444.9pt;height:111.35pt;z-index:251661312;visibility:visible;mso-wrap-style:square;mso-wrap-distance-left:9pt;mso-wrap-distance-top:3.6pt;mso-wrap-distance-right:9pt;mso-wrap-distance-bottom:3.6pt;mso-position-horizontal:absolute;mso-position-horizontal-relative:text;mso-position-vertical:absolute;mso-position-vertical-relative:text;v-text-anchor:top" o:gfxdata="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" filled="f" stroked="f">
+              <v:textbox inset="2.53958mm,1.2694mm,2.53958mm,1.2694mm">
+                <w:txbxContent>
+                  <w:p>
+                    <w:pPr>
+                      <w:spacing w:after="0" w:line="240" w:lineRule="auto"/>
+                      <w:jc w:val="center"/>
+                      <w:textDirection w:val="btLr"/>
+                    </w:pPr>
+                    <w:r>
+                      <w:rPr>
+                        <w:rFonts w:ascii="Metropolis" w:eastAsia="Metropolis" w:hAnsi="Metropolis" w:cs="Metropolis"/>
+                        <w:color w:val="000000"/>
+                        <w:sz w:val="20"/>
+                      </w:rPr>
+                      <w:t>www.somospapyrus.com.br</w:t>
+                    </w:r>
+                  </w:p>
+                </w:txbxContent>
+              </v:textbox>
+            </v:rect>
+          </w:pict>
+        </mc:Fallback>
+      </mc:AlternateContent>
+    </w:r>
+    <w:r>
+      <w:rPr>
+        <w:noProof/>
+      </w:rPr>
+      <w:drawing>
+        <wp:anchor distT="0" distB="0" distL="114300" distR="114300" simplePos="0" relativeHeight="251659264" behindDoc="0" locked="0" layoutInCell="1" hidden="0" allowOverlap="1" wp14:anchorId="340E7E21" wp14:editId="1FD51659">
+          <wp:simplePos x="0" y="0"/>
+          <wp:positionH relativeFrom="column">
+            <wp:posOffset>1</wp:posOffset>
+          </wp:positionH>
+          <wp:positionV relativeFrom="paragraph">
+            <wp:posOffset>120963</wp:posOffset>
+          </wp:positionV>
+          <wp:extent cx="361950" cy="361950"/>
+          <wp:effectExtent l="0" t="0" r="0" b="0"/>
+          <wp:wrapNone/>
+          <wp:docPr id="199" name="image3.png"/>
+          <wp:cNvGraphicFramePr/>
+          <a:graphic xmlns:a="http://schemas.openxmlformats.org/drawingml/2006/main">
+            <a:graphicData uri="http://schemas.openxmlformats.org/drawingml/2006/picture">
+              <pic:pic xmlns:pic="http://schemas.openxmlformats.org/drawingml/2006/picture">
+                <pic:nvPicPr>
+                  <pic:cNvPr id="0" name="image3.png"/>
+                  <pic:cNvPicPr preferRelativeResize="0"/>
+                </pic:nvPicPr>
+                <pic:blipFill>
+                  <a:blip r:embed="rId1"/>
+                  <a:srcRect l="13934" t="13582" r="13746" b="13747"/>
+                  <a:stretch>
+                    <a:fillRect/>
+                  </a:stretch>
+                </pic:blipFill>
+                <pic:spPr>
+                  <a:xfrm>
+                    <a:off x="0" y="0"/>
+                    <a:ext cx="361950" cy="361950"/>
+                  </a:xfrm>
+                  <a:prstGeom prst="rect">
+                    <a:avLst/>
+                  </a:prstGeom>
+                  <a:ln/>
+                </pic:spPr>
+              </pic:pic>
+            </a:graphicData>
+          </a:graphic>
+        </wp:anchor>
+      </w:drawing>
+    </w:r>
+    <w:r>
+      <w:rPr>
+        <w:noProof/>
+      </w:rPr>
+      <mc:AlternateContent>
+        <mc:Choice Requires="wps">
+          <w:drawing>
+            <wp:anchor distT="45720" distB="45720" distL="114300" distR="114300" simplePos="0" relativeHeight="251660288" behindDoc="0" locked="0" layoutInCell="1" hidden="0" allowOverlap="1" wp14:anchorId="24DF5539" wp14:editId="0C2FC93E">
+              <wp:simplePos x="0" y="0"/>
+              <wp:positionH relativeFrom="column">
+                <wp:posOffset>1504316</wp:posOffset>
+              </wp:positionH>
+              <wp:positionV relativeFrom="paragraph">
+                <wp:posOffset>147320</wp:posOffset>
+              </wp:positionV>
+              <wp:extent cx="5650230" cy="1414145"/>
+              <wp:effectExtent l="0" t="0" r="0" b="0"/>
+              <wp:wrapNone/>
+              <wp:docPr id="197" name="Retângulo 197"/>
+              <wp:cNvGraphicFramePr/>
+              <a:graphic xmlns:a="http://schemas.openxmlformats.org/drawingml/2006/main">
+                <a:graphicData uri="http://schemas.microsoft.com/office/word/2010/wordprocessingShape">
+                  <wps:wsp>
+                    <wps:cNvSpPr/>
+                    <wps:spPr>
+                      <a:xfrm>
+                        <a:off x="2525648" y="3077690"/>
+                        <a:ext cx="5640705" cy="1404620"/>
+                      </a:xfrm>
+                      <a:prstGeom prst="rect">
+                        <a:avLst/>
+                      </a:prstGeom>
+                      <a:noFill/>
+                      <a:ln>
+                        <a:noFill/>
+                      </a:ln>
+                    </wps:spPr>
+                    <wps:txbx>
+                      <w:txbxContent>
+                        <w:p>
+                          <w:pPr>
+                            <w:spacing w:after="0" w:line="240" w:lineRule="auto"/>
+                            <w:jc w:val="center"/>
+                            <w:textDirection w:val="btLr"/>
+                          </w:pPr>
+                          <w:r>
+                            <w:rPr>
+                              <w:rFonts w:ascii="Metropolis" w:eastAsia="Metropolis" w:hAnsi="Metropolis" w:cs="Metropolis"/>
+                              <w:color w:val="0070C0"/>
+                              <w:sz w:val="20"/>
+                            </w:rPr>
+                            <w:t xml:space="preserve">Sistema de Gestão da Integrada - SGI | PAGE   </w:t>
+                          </w:r>
+                        </w:p>
+                      </w:txbxContent>
+                    </wps:txbx>
+                    <wps:bodyPr spcFirstLastPara="1" wrap="square" lIns="91425" tIns="45700" rIns="91425" bIns="45700" anchor="t" anchorCtr="0">
+                      <a:noAutofit/>
+                    </wps:bodyPr>
+                  </wps:wsp>
+                </a:graphicData>
+              </a:graphic>
+            </wp:anchor>
+          </w:drawing>
+        </mc:Choice>
+        <mc:Fallback>
+          <w:pict>
+            <v:rect w14:anchorId="24DF5539" id="_x0000_s1029" style="position:absolute;left:0;text-align:left;margin-left:118.45pt;margin-top:11.6pt;width:444.9pt;height:111.35pt;z-index:251660288;visibility:visible;mso-wrap-style:square;mso-wrap-distance-left:9pt;mso-wrap-distance-top:3.6pt;mso-wrap-distance-right:9pt;mso-wrap-distance-bottom:3.6pt;mso-position-horizontal:absolute;mso-position-horizontal-relative:text;mso-position-vertical:absolute;mso-position-vertical-relative:text;v-text-anchor:top" o:gfxdata="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" filled="f" stroked="f">
+              <v:textbox inset="2.53958mm,1.2694mm,2.53958mm,1.2694mm">
+                <w:txbxContent>
+                  <w:p>
+                    <w:pPr>
+                      <w:spacing w:after="0" w:line="240" w:lineRule="auto"/>
+                      <w:jc w:val="center"/>
+                      <w:textDirection w:val="btLr"/>
+                    </w:pPr>
+                    <w:r>
+                      <w:rPr>
+                        <w:rFonts w:ascii="Metropolis" w:eastAsia="Metropolis" w:hAnsi="Metropolis" w:cs="Metropolis"/>
+                        <w:color w:val="0070C0"/>
+                        <w:sz w:val="20"/>
+                      </w:rPr>
+                      <w:t xml:space="preserve">Sistema de Gestão da Integrada - SGI | PAGE   </w:t>
+                    </w:r>
+                  </w:p>
+                </w:txbxContent>
+              </v:textbox>
+            </v:rect>
+          </w:pict>
+        </mc:Fallback>
+      </mc:AlternateContent>
+    </w:r>
+  </w:p>
+  <w:p>
+    <w:pPr>
+      <w:keepLines/>
+      <w:pBdr>
+        <w:top w:val="nil"/>
+        <w:left w:val="nil"/>
+        <w:bottom w:val="nil"/>
+        <w:right w:val="nil"/>
+        <w:between w:val="nil"/>
+      </w:pBdr>
+      <w:tabs>
+        <w:tab w:val="center" w:pos="4320"/>
+        <w:tab w:val="right" w:pos="8640"/>
+      </w:tabs>
+      <w:spacing w:after="0" w:line="240" w:lineRule="auto"/>
+      <w:rPr>
+        <w:rFonts w:ascii="Times New Roman" w:eastAsia="Times New Roman" w:hAnsi="Times New Roman" w:cs="Times New Roman"/>
+        <w:color w:val="000000"/>
+        <w:sz w:val="20"/>
+        <w:szCs w:val="20"/>
+      </w:rPr>
+    </w:pPr>
+  </w:p>
+  <w:p>
+    <w:pPr>
+      <w:keepLines/>
+      <w:pBdr>
+        <w:top w:val="nil"/>
+        <w:left w:val="nil"/>
+        <w:bottom w:val="nil"/>
+        <w:right w:val="nil"/>
+        <w:between w:val="nil"/>
+      </w:pBdr>
+      <w:tabs>
+        <w:tab w:val="center" w:pos="4320"/>
+        <w:tab w:val="right" w:pos="8640"/>
+      </w:tabs>
+      <w:spacing w:after="0" w:line="240" w:lineRule="auto"/>
+      <w:rPr>
+        <w:rFonts w:ascii="Times New Roman" w:eastAsia="Times New Roman" w:hAnsi="Times New Roman" w:cs="Times New Roman"/>
+        <w:color w:val="000000"/>
+        <w:sz w:val="20"/>
+        <w:szCs w:val="20"/>
+      </w:rPr>
+    </w:pPr>
+    <w:r>
+      <w:rPr>
+        <w:noProof/>
+      </w:rPr>
+      <mc:AlternateContent>
+        <mc:Choice Requires="wpg">
+          <w:drawing>
+            <wp:anchor distT="0" distB="0" distL="114300" distR="114300" simplePos="0" relativeHeight="251662336" behindDoc="0" locked="0" layoutInCell="1" hidden="0" allowOverlap="1" wp14:anchorId="5D698D1A" wp14:editId="35570ACB">
+              <wp:simplePos x="0" y="0"/>
+              <wp:positionH relativeFrom="column">
+                <wp:posOffset>3841115</wp:posOffset>
+              </wp:positionH>
+              <wp:positionV relativeFrom="paragraph">
+                <wp:posOffset>76200</wp:posOffset>
+              </wp:positionV>
+              <wp:extent cx="970915" cy="270510"/>
+              <wp:effectExtent l="0" t="0" r="0" b="0"/>
+              <wp:wrapNone/>
+              <wp:docPr id="195" name="Retângulo 195"/>
+              <wp:cNvGraphicFramePr/>
+              <a:graphic xmlns:a="http://schemas.openxmlformats.org/drawingml/2006/main">
+                <a:graphicData uri="http://schemas.microsoft.com/office/word/2010/wordprocessingShape">
+                  <wps:wsp>
+                    <wps:cNvSpPr/>
+                    <wps:spPr>
+                      <a:xfrm>
+                        <a:off x="4865305" y="3649508"/>
+                        <a:ext cx="961390" cy="260985"/>
+                      </a:xfrm>
+                      <a:prstGeom prst="rect">
+                        <a:avLst/>
+                      </a:prstGeom>
+                      <a:solidFill>
+                        <a:schemeClr val="lt1"/>
+                      </a:solidFill>
+                      <a:ln>
+                        <a:noFill/>
+                      </a:ln>
+                    </wps:spPr>
+                    <wps:txbx>
+                      <w:txbxContent>
+                        <w:p>
+                          <w:pPr>
+                            <w:spacing w:line="258" w:lineRule="auto"/>
+                            <w:textDirection w:val="btLr"/>
+                          </w:pPr>
+                        </w:p>
+                      </w:txbxContent>
+                    </wps:txbx>
+                    <wps:bodyPr spcFirstLastPara="1" wrap="square" lIns="91425" tIns="45700" rIns="91425" bIns="45700" anchor="t" anchorCtr="0">
+                      <a:noAutofit/>
+                    </wps:bodyPr>
+                  </wps:wsp>
+                </a:graphicData>
+              </a:graphic>
+            </wp:anchor>
+          </w:drawing>
+        </mc:Choice>
+        <mc:Fallback xmlns:sl="http://schemas.openxmlformats.org/schemaLibrary/2006/main" xmlns:a="http://schemas.openxmlformats.org/drawingml/2006/main" xmlns:pic="http://schemas.openxmlformats.org/drawingml/2006/picture" xmlns:c="http://schemas.openxmlformats.org/drawingml/2006/chart" xmlns:lc="http://schemas.openxmlformats.org/drawingml/2006/lockedCanvas" xmlns:dgm="http://schemas.openxmlformats.org/drawingml/2006/diagram" xmlns="http://schemas.microsoft.com/office/tasks/2019/documenttasks" xmlns:cr="http://schemas.microsoft.com/office/comments/2020/reactions">
+          <w:drawing>
+            <wp:anchor allowOverlap="1" behindDoc="0" distB="0" distT="0" distL="114300" distR="114300" hidden="0" layoutInCell="1" locked="0" relativeHeight="0" simplePos="0">
+              <wp:simplePos x="0" y="0"/>
+              <wp:positionH relativeFrom="column">
+                <wp:posOffset>3841115</wp:posOffset>
               </wp:positionH>
               <wp:positionV relativeFrom="paragraph">
                 <wp:posOffset>76200</wp:posOffset>

</xml_diff>